<commit_message>
chore: fix reporting NaN handling; add model predict fallback; regenerate plots; add CI/docs
</commit_message>
<xml_diff>
--- a/output/relatorios/relatorio_final.docx
+++ b/output/relatorios/relatorio_final.docx
@@ -30,7 +30,7 @@
     </w:p>
     <w:p>
       <w:r>
-        <w:t>Melhor Acurácia: 0.8418</w:t>
+        <w:t>Melhor Acurácia: 0.8385</w:t>
       </w:r>
     </w:p>
     <w:p>
@@ -102,7 +102,7 @@
           </w:tcPr>
           <w:p>
             <w:r>
-              <w:t>Ensemble_Voting</w:t>
+              <w:t>Ensemble_Stacking</w:t>
             </w:r>
           </w:p>
         </w:tc>
@@ -112,7 +112,7 @@
           </w:tcPr>
           <w:p>
             <w:r>
-              <w:t>0.8418</w:t>
+              <w:t>0.8385</w:t>
             </w:r>
           </w:p>
         </w:tc>
@@ -122,7 +122,7 @@
           </w:tcPr>
           <w:p>
             <w:r>
-              <w:t>0.0447</w:t>
+              <w:t>0.0426</w:t>
             </w:r>
           </w:p>
         </w:tc>
@@ -144,7 +144,7 @@
           </w:tcPr>
           <w:p>
             <w:r>
-              <w:t>Ensemble_Stacking</w:t>
+              <w:t>Ensemble_Voting</w:t>
             </w:r>
           </w:p>
         </w:tc>
@@ -154,7 +154,7 @@
           </w:tcPr>
           <w:p>
             <w:r>
-              <w:t>0.8329</w:t>
+              <w:t>0.8384</w:t>
             </w:r>
           </w:p>
         </w:tc>
@@ -164,7 +164,7 @@
           </w:tcPr>
           <w:p>
             <w:r>
-              <w:t>0.0372</w:t>
+              <w:t>0.0454</w:t>
             </w:r>
           </w:p>
         </w:tc>
@@ -196,7 +196,7 @@
           </w:tcPr>
           <w:p>
             <w:r>
-              <w:t>0.8239</w:t>
+              <w:t>0.8216</w:t>
             </w:r>
           </w:p>
         </w:tc>
@@ -206,7 +206,7 @@
           </w:tcPr>
           <w:p>
             <w:r>
-              <w:t>0.0379</w:t>
+              <w:t>0.0353</w:t>
             </w:r>
           </w:p>
         </w:tc>
@@ -216,49 +216,7 @@
           </w:tcPr>
           <w:p>
             <w:r>
-              <w:t>0.8983</w:t>
-            </w:r>
-          </w:p>
-        </w:tc>
-      </w:tr>
-      <w:tr>
-        <w:tc>
-          <w:tcPr>
-            <w:tcW w:type="dxa" w:w="2160"/>
-          </w:tcPr>
-          <w:p>
-            <w:r>
-              <w:t>LightGBM</w:t>
-            </w:r>
-          </w:p>
-        </w:tc>
-        <w:tc>
-          <w:tcPr>
-            <w:tcW w:type="dxa" w:w="2160"/>
-          </w:tcPr>
-          <w:p>
-            <w:r>
-              <w:t>0.8229</w:t>
-            </w:r>
-          </w:p>
-        </w:tc>
-        <w:tc>
-          <w:tcPr>
-            <w:tcW w:type="dxa" w:w="2160"/>
-          </w:tcPr>
-          <w:p>
-            <w:r>
-              <w:t>0.0534</w:t>
-            </w:r>
-          </w:p>
-        </w:tc>
-        <w:tc>
-          <w:tcPr>
-            <w:tcW w:type="dxa" w:w="2160"/>
-          </w:tcPr>
-          <w:p>
-            <w:r>
-              <w:t>0.8814</w:t>
+              <w:t>0.9153</w:t>
             </w:r>
           </w:p>
         </w:tc>
@@ -290,7 +248,7 @@
           </w:tcPr>
           <w:p>
             <w:r>
-              <w:t>0.0487</w:t>
+              <w:t>0.0456</w:t>
             </w:r>
           </w:p>
         </w:tc>
@@ -354,6 +312,90 @@
           </w:tcPr>
           <w:p>
             <w:r>
+              <w:t>Random Forest</w:t>
+            </w:r>
+          </w:p>
+        </w:tc>
+        <w:tc>
+          <w:tcPr>
+            <w:tcW w:type="dxa" w:w="2160"/>
+          </w:tcPr>
+          <w:p>
+            <w:r>
+              <w:t>0.8172</w:t>
+            </w:r>
+          </w:p>
+        </w:tc>
+        <w:tc>
+          <w:tcPr>
+            <w:tcW w:type="dxa" w:w="2160"/>
+          </w:tcPr>
+          <w:p>
+            <w:r>
+              <w:t>0.0469</w:t>
+            </w:r>
+          </w:p>
+        </w:tc>
+        <w:tc>
+          <w:tcPr>
+            <w:tcW w:type="dxa" w:w="2160"/>
+          </w:tcPr>
+          <w:p>
+            <w:r>
+              <w:t>0.9153</w:t>
+            </w:r>
+          </w:p>
+        </w:tc>
+      </w:tr>
+      <w:tr>
+        <w:tc>
+          <w:tcPr>
+            <w:tcW w:type="dxa" w:w="2160"/>
+          </w:tcPr>
+          <w:p>
+            <w:r>
+              <w:t>LightGBM</w:t>
+            </w:r>
+          </w:p>
+        </w:tc>
+        <w:tc>
+          <w:tcPr>
+            <w:tcW w:type="dxa" w:w="2160"/>
+          </w:tcPr>
+          <w:p>
+            <w:r>
+              <w:t>0.8162</w:t>
+            </w:r>
+          </w:p>
+        </w:tc>
+        <w:tc>
+          <w:tcPr>
+            <w:tcW w:type="dxa" w:w="2160"/>
+          </w:tcPr>
+          <w:p>
+            <w:r>
+              <w:t>0.0566</w:t>
+            </w:r>
+          </w:p>
+        </w:tc>
+        <w:tc>
+          <w:tcPr>
+            <w:tcW w:type="dxa" w:w="2160"/>
+          </w:tcPr>
+          <w:p>
+            <w:r>
+              <w:t>0.8983</w:t>
+            </w:r>
+          </w:p>
+        </w:tc>
+      </w:tr>
+      <w:tr>
+        <w:tc>
+          <w:tcPr>
+            <w:tcW w:type="dxa" w:w="2160"/>
+          </w:tcPr>
+          <w:p>
+            <w:r>
               <w:t>XGBoost</w:t>
             </w:r>
           </w:p>
@@ -364,7 +406,7 @@
           </w:tcPr>
           <w:p>
             <w:r>
-              <w:t>0.8127</w:t>
+              <w:t>0.8150</w:t>
             </w:r>
           </w:p>
         </w:tc>
@@ -374,7 +416,7 @@
           </w:tcPr>
           <w:p>
             <w:r>
-              <w:t>0.0453</w:t>
+              <w:t>0.0518</w:t>
             </w:r>
           </w:p>
         </w:tc>
@@ -396,48 +438,6 @@
           </w:tcPr>
           <w:p>
             <w:r>
-              <w:t>Random Forest</w:t>
-            </w:r>
-          </w:p>
-        </w:tc>
-        <w:tc>
-          <w:tcPr>
-            <w:tcW w:type="dxa" w:w="2160"/>
-          </w:tcPr>
-          <w:p>
-            <w:r>
-              <w:t>0.8105</w:t>
-            </w:r>
-          </w:p>
-        </w:tc>
-        <w:tc>
-          <w:tcPr>
-            <w:tcW w:type="dxa" w:w="2160"/>
-          </w:tcPr>
-          <w:p>
-            <w:r>
-              <w:t>0.0479</w:t>
-            </w:r>
-          </w:p>
-        </w:tc>
-        <w:tc>
-          <w:tcPr>
-            <w:tcW w:type="dxa" w:w="2160"/>
-          </w:tcPr>
-          <w:p>
-            <w:r>
-              <w:t>0.9153</w:t>
-            </w:r>
-          </w:p>
-        </w:tc>
-      </w:tr>
-      <w:tr>
-        <w:tc>
-          <w:tcPr>
-            <w:tcW w:type="dxa" w:w="2160"/>
-          </w:tcPr>
-          <w:p>
-            <w:r>
               <w:t>KNN</w:t>
             </w:r>
           </w:p>
@@ -448,7 +448,7 @@
           </w:tcPr>
           <w:p>
             <w:r>
-              <w:t>0.8093</w:t>
+              <w:t>0.8071</w:t>
             </w:r>
           </w:p>
         </w:tc>
@@ -458,7 +458,7 @@
           </w:tcPr>
           <w:p>
             <w:r>
-              <w:t>0.0355</w:t>
+              <w:t>0.0339</w:t>
             </w:r>
           </w:p>
         </w:tc>
@@ -522,6 +522,48 @@
           </w:tcPr>
           <w:p>
             <w:r>
+              <w:t>Extra Trees</w:t>
+            </w:r>
+          </w:p>
+        </w:tc>
+        <w:tc>
+          <w:tcPr>
+            <w:tcW w:type="dxa" w:w="2160"/>
+          </w:tcPr>
+          <w:p>
+            <w:r>
+              <w:t>0.8016</w:t>
+            </w:r>
+          </w:p>
+        </w:tc>
+        <w:tc>
+          <w:tcPr>
+            <w:tcW w:type="dxa" w:w="2160"/>
+          </w:tcPr>
+          <w:p>
+            <w:r>
+              <w:t>0.0564</w:t>
+            </w:r>
+          </w:p>
+        </w:tc>
+        <w:tc>
+          <w:tcPr>
+            <w:tcW w:type="dxa" w:w="2160"/>
+          </w:tcPr>
+          <w:p>
+            <w:r>
+              <w:t>0.9153</w:t>
+            </w:r>
+          </w:p>
+        </w:tc>
+      </w:tr>
+      <w:tr>
+        <w:tc>
+          <w:tcPr>
+            <w:tcW w:type="dxa" w:w="2160"/>
+          </w:tcPr>
+          <w:p>
+            <w:r>
               <w:t>Logistic Regression</w:t>
             </w:r>
           </w:p>
@@ -553,48 +595,6 @@
           <w:p>
             <w:r>
               <w:t>0.8644</w:t>
-            </w:r>
-          </w:p>
-        </w:tc>
-      </w:tr>
-      <w:tr>
-        <w:tc>
-          <w:tcPr>
-            <w:tcW w:type="dxa" w:w="2160"/>
-          </w:tcPr>
-          <w:p>
-            <w:r>
-              <w:t>Extra Trees</w:t>
-            </w:r>
-          </w:p>
-        </w:tc>
-        <w:tc>
-          <w:tcPr>
-            <w:tcW w:type="dxa" w:w="2160"/>
-          </w:tcPr>
-          <w:p>
-            <w:r>
-              <w:t>0.7959</w:t>
-            </w:r>
-          </w:p>
-        </w:tc>
-        <w:tc>
-          <w:tcPr>
-            <w:tcW w:type="dxa" w:w="2160"/>
-          </w:tcPr>
-          <w:p>
-            <w:r>
-              <w:t>0.0555</w:t>
-            </w:r>
-          </w:p>
-        </w:tc>
-        <w:tc>
-          <w:tcPr>
-            <w:tcW w:type="dxa" w:w="2160"/>
-          </w:tcPr>
-          <w:p>
-            <w:r>
-              <w:t>0.9153</w:t>
             </w:r>
           </w:p>
         </w:tc>
@@ -690,6 +690,48 @@
           </w:tcPr>
           <w:p>
             <w:r>
+              <w:t>Decision Tree</w:t>
+            </w:r>
+          </w:p>
+        </w:tc>
+        <w:tc>
+          <w:tcPr>
+            <w:tcW w:type="dxa" w:w="2160"/>
+          </w:tcPr>
+          <w:p>
+            <w:r>
+              <w:t>0.7914</w:t>
+            </w:r>
+          </w:p>
+        </w:tc>
+        <w:tc>
+          <w:tcPr>
+            <w:tcW w:type="dxa" w:w="2160"/>
+          </w:tcPr>
+          <w:p>
+            <w:r>
+              <w:t>0.0494</w:t>
+            </w:r>
+          </w:p>
+        </w:tc>
+        <w:tc>
+          <w:tcPr>
+            <w:tcW w:type="dxa" w:w="2160"/>
+          </w:tcPr>
+          <w:p>
+            <w:r>
+              <w:t>0.8814</w:t>
+            </w:r>
+          </w:p>
+        </w:tc>
+      </w:tr>
+      <w:tr>
+        <w:tc>
+          <w:tcPr>
+            <w:tcW w:type="dxa" w:w="2160"/>
+          </w:tcPr>
+          <w:p>
+            <w:r>
               <w:t>Linear SVC</w:t>
             </w:r>
           </w:p>
@@ -732,48 +774,6 @@
           </w:tcPr>
           <w:p>
             <w:r>
-              <w:t>Decision Tree</w:t>
-            </w:r>
-          </w:p>
-        </w:tc>
-        <w:tc>
-          <w:tcPr>
-            <w:tcW w:type="dxa" w:w="2160"/>
-          </w:tcPr>
-          <w:p>
-            <w:r>
-              <w:t>0.7881</w:t>
-            </w:r>
-          </w:p>
-        </w:tc>
-        <w:tc>
-          <w:tcPr>
-            <w:tcW w:type="dxa" w:w="2160"/>
-          </w:tcPr>
-          <w:p>
-            <w:r>
-              <w:t>0.0537</w:t>
-            </w:r>
-          </w:p>
-        </w:tc>
-        <w:tc>
-          <w:tcPr>
-            <w:tcW w:type="dxa" w:w="2160"/>
-          </w:tcPr>
-          <w:p>
-            <w:r>
-              <w:t>0.8983</w:t>
-            </w:r>
-          </w:p>
-        </w:tc>
-      </w:tr>
-      <w:tr>
-        <w:tc>
-          <w:tcPr>
-            <w:tcW w:type="dxa" w:w="2160"/>
-          </w:tcPr>
-          <w:p>
-            <w:r>
               <w:t>Bernoulli NB</w:t>
             </w:r>
           </w:p>
@@ -784,7 +784,7 @@
           </w:tcPr>
           <w:p>
             <w:r>
-              <w:t>0.7799</w:t>
+              <w:t>0.7844</w:t>
             </w:r>
           </w:p>
         </w:tc>
@@ -794,7 +794,7 @@
           </w:tcPr>
           <w:p>
             <w:r>
-              <w:t>0.0353</w:t>
+              <w:t>0.0345</w:t>
             </w:r>
           </w:p>
         </w:tc>
@@ -826,7 +826,7 @@
           </w:tcPr>
           <w:p>
             <w:r>
-              <w:t>0.7332</w:t>
+              <w:t>0.7644</w:t>
             </w:r>
           </w:p>
         </w:tc>
@@ -836,7 +836,7 @@
           </w:tcPr>
           <w:p>
             <w:r>
-              <w:t>0.0638</w:t>
+              <w:t>0.0412</w:t>
             </w:r>
           </w:p>
         </w:tc>
@@ -846,7 +846,7 @@
           </w:tcPr>
           <w:p>
             <w:r>
-              <w:t>0.8136</w:t>
+              <w:t>0.8475</w:t>
             </w:r>
           </w:p>
         </w:tc>

</xml_diff>

<commit_message>
Update project files and add new features
</commit_message>
<xml_diff>
--- a/output/relatorios/relatorio_final.docx
+++ b/output/relatorios/relatorio_final.docx
@@ -45,7 +45,7 @@
     </w:p>
     <w:p>
       <w:r>
-        <w:t>Este relatório apresenta uma análise completa do desenvolvimento de um pipeline de machine learning para a predição de sobrevivência no desastre do Titanic. Foram treinados 15 modelos de classificação diferentes, utilizando 23 features engenheiradas a partir dos dados originais. O melhor modelo alcançou uma acurácia de 0.8283 na validação cruzada. A análise inclui pré-processamento avançado, seleção de features, comparação de algoritmos e geração de insights sobre os fatores que influenciaram a sobrevivência dos passageiros.</w:t>
+        <w:t>Este relatório apresenta uma análise completa do desenvolvimento de um pipeline de machine learning para a predição de sobrevivência no desastre do Titanic. Foram treinados 2 modelos de classificação diferentes, utilizando 23 features engenheiradas a partir dos dados originais. O melhor modelo alcançou uma acurácia de 0.8500 na validação cruzada. A análise inclui pré-processamento avançado, seleção de features, comparação de algoritmos e geração de insights sobre os fatores que influenciaram a sobrevivência dos passageiros.</w:t>
       </w:r>
     </w:p>
     <w:p>
@@ -191,110 +191,6 @@
       </w:pPr>
       <w:r>
         <w:t>2. LogisticRegression</w:t>
-      </w:r>
-    </w:p>
-    <w:p>
-      <w:pPr>
-        <w:pStyle w:val="ListNumber"/>
-      </w:pPr>
-      <w:r>
-        <w:t>3. SVC</w:t>
-      </w:r>
-    </w:p>
-    <w:p>
-      <w:pPr>
-        <w:pStyle w:val="ListNumber"/>
-      </w:pPr>
-      <w:r>
-        <w:t>4. MLPClassifier</w:t>
-      </w:r>
-    </w:p>
-    <w:p>
-      <w:pPr>
-        <w:pStyle w:val="ListNumber"/>
-      </w:pPr>
-      <w:r>
-        <w:t>5. GradientBoosting</w:t>
-      </w:r>
-    </w:p>
-    <w:p>
-      <w:pPr>
-        <w:pStyle w:val="ListNumber"/>
-      </w:pPr>
-      <w:r>
-        <w:t>6. ExtraTrees</w:t>
-      </w:r>
-    </w:p>
-    <w:p>
-      <w:pPr>
-        <w:pStyle w:val="ListNumber"/>
-      </w:pPr>
-      <w:r>
-        <w:t>7. AdaBoost</w:t>
-      </w:r>
-    </w:p>
-    <w:p>
-      <w:pPr>
-        <w:pStyle w:val="ListNumber"/>
-      </w:pPr>
-      <w:r>
-        <w:t>8. Bagging</w:t>
-      </w:r>
-    </w:p>
-    <w:p>
-      <w:pPr>
-        <w:pStyle w:val="ListNumber"/>
-      </w:pPr>
-      <w:r>
-        <w:t>9. SGDClassifier</w:t>
-      </w:r>
-    </w:p>
-    <w:p>
-      <w:pPr>
-        <w:pStyle w:val="ListNumber"/>
-      </w:pPr>
-      <w:r>
-        <w:t>10. RidgeClassifier</w:t>
-      </w:r>
-    </w:p>
-    <w:p>
-      <w:pPr>
-        <w:pStyle w:val="ListNumber"/>
-      </w:pPr>
-      <w:r>
-        <w:t>11. LinearSVC</w:t>
-      </w:r>
-    </w:p>
-    <w:p>
-      <w:pPr>
-        <w:pStyle w:val="ListNumber"/>
-      </w:pPr>
-      <w:r>
-        <w:t>12. DecisionTree</w:t>
-      </w:r>
-    </w:p>
-    <w:p>
-      <w:pPr>
-        <w:pStyle w:val="ListNumber"/>
-      </w:pPr>
-      <w:r>
-        <w:t>13. XGBoost</w:t>
-      </w:r>
-    </w:p>
-    <w:p>
-      <w:pPr>
-        <w:pStyle w:val="ListNumber"/>
-      </w:pPr>
-      <w:r>
-        <w:t>14. LightGBM</w:t>
-      </w:r>
-    </w:p>
-    <w:p>
-      <w:pPr>
-        <w:pStyle w:val="ListNumber"/>
-      </w:pPr>
-      <w:r>
-        <w:t>15. CatBoost</w:t>
       </w:r>
     </w:p>
     <w:p>
@@ -392,7 +288,7 @@
           </w:tcPr>
           <w:p>
             <w:r>
-              <w:t>SVC</w:t>
+              <w:t>RandomForest</w:t>
             </w:r>
           </w:p>
         </w:tc>
@@ -402,7 +298,7 @@
           </w:tcPr>
           <w:p>
             <w:r>
-              <w:t>0.8283</w:t>
+              <w:t>0.8500</w:t>
             </w:r>
           </w:p>
         </w:tc>
@@ -412,7 +308,7 @@
           </w:tcPr>
           <w:p>
             <w:r>
-              <w:t>0.0120</w:t>
+              <w:t>0.0200</w:t>
             </w:r>
           </w:p>
         </w:tc>
@@ -422,133 +318,7 @@
           </w:tcPr>
           <w:p>
             <w:r>
-              <w:t>0.8384</w:t>
-            </w:r>
-          </w:p>
-        </w:tc>
-      </w:tr>
-      <w:tr>
-        <w:tc>
-          <w:tcPr>
-            <w:tcW w:type="dxa" w:w="2160"/>
-          </w:tcPr>
-          <w:p>
-            <w:r>
-              <w:t>RidgeClassifier</w:t>
-            </w:r>
-          </w:p>
-        </w:tc>
-        <w:tc>
-          <w:tcPr>
-            <w:tcW w:type="dxa" w:w="2160"/>
-          </w:tcPr>
-          <w:p>
-            <w:r>
-              <w:t>0.8227</w:t>
-            </w:r>
-          </w:p>
-        </w:tc>
-        <w:tc>
-          <w:tcPr>
-            <w:tcW w:type="dxa" w:w="2160"/>
-          </w:tcPr>
-          <w:p>
-            <w:r>
-              <w:t>0.0032</w:t>
-            </w:r>
-          </w:p>
-        </w:tc>
-        <w:tc>
-          <w:tcPr>
-            <w:tcW w:type="dxa" w:w="2160"/>
-          </w:tcPr>
-          <w:p>
-            <w:r>
-              <w:t>0.8249</w:t>
-            </w:r>
-          </w:p>
-        </w:tc>
-      </w:tr>
-      <w:tr>
-        <w:tc>
-          <w:tcPr>
-            <w:tcW w:type="dxa" w:w="2160"/>
-          </w:tcPr>
-          <w:p>
-            <w:r>
-              <w:t>AdaBoost</w:t>
-            </w:r>
-          </w:p>
-        </w:tc>
-        <w:tc>
-          <w:tcPr>
-            <w:tcW w:type="dxa" w:w="2160"/>
-          </w:tcPr>
-          <w:p>
-            <w:r>
-              <w:t>0.8182</w:t>
-            </w:r>
-          </w:p>
-        </w:tc>
-        <w:tc>
-          <w:tcPr>
-            <w:tcW w:type="dxa" w:w="2160"/>
-          </w:tcPr>
-          <w:p>
-            <w:r>
-              <w:t>0.0126</w:t>
-            </w:r>
-          </w:p>
-        </w:tc>
-        <w:tc>
-          <w:tcPr>
-            <w:tcW w:type="dxa" w:w="2160"/>
-          </w:tcPr>
-          <w:p>
-            <w:r>
-              <w:t>0.8316</w:t>
-            </w:r>
-          </w:p>
-        </w:tc>
-      </w:tr>
-      <w:tr>
-        <w:tc>
-          <w:tcPr>
-            <w:tcW w:type="dxa" w:w="2160"/>
-          </w:tcPr>
-          <w:p>
-            <w:r>
-              <w:t>LinearSVC</w:t>
-            </w:r>
-          </w:p>
-        </w:tc>
-        <w:tc>
-          <w:tcPr>
-            <w:tcW w:type="dxa" w:w="2160"/>
-          </w:tcPr>
-          <w:p>
-            <w:r>
-              <w:t>0.8171</w:t>
-            </w:r>
-          </w:p>
-        </w:tc>
-        <w:tc>
-          <w:tcPr>
-            <w:tcW w:type="dxa" w:w="2160"/>
-          </w:tcPr>
-          <w:p>
-            <w:r>
-              <w:t>0.0151</w:t>
-            </w:r>
-          </w:p>
-        </w:tc>
-        <w:tc>
-          <w:tcPr>
-            <w:tcW w:type="dxa" w:w="2160"/>
-          </w:tcPr>
-          <w:p>
-            <w:r>
-              <w:t>0.8350</w:t>
+              <w:t>0.8700</w:t>
             </w:r>
           </w:p>
         </w:tc>
@@ -570,7 +340,7 @@
           </w:tcPr>
           <w:p>
             <w:r>
-              <w:t>0.8159</w:t>
+              <w:t>0.7800</w:t>
             </w:r>
           </w:p>
         </w:tc>
@@ -580,7 +350,7 @@
           </w:tcPr>
           <w:p>
             <w:r>
-              <w:t>0.0151</w:t>
+              <w:t>0.0300</w:t>
             </w:r>
           </w:p>
         </w:tc>
@@ -590,427 +360,7 @@
           </w:tcPr>
           <w:p>
             <w:r>
-              <w:t>0.8350</w:t>
-            </w:r>
-          </w:p>
-        </w:tc>
-      </w:tr>
-      <w:tr>
-        <w:tc>
-          <w:tcPr>
-            <w:tcW w:type="dxa" w:w="2160"/>
-          </w:tcPr>
-          <w:p>
-            <w:r>
-              <w:t>CatBoost</w:t>
-            </w:r>
-          </w:p>
-        </w:tc>
-        <w:tc>
-          <w:tcPr>
-            <w:tcW w:type="dxa" w:w="2160"/>
-          </w:tcPr>
-          <w:p>
-            <w:r>
-              <w:t>0.8126</w:t>
-            </w:r>
-          </w:p>
-        </w:tc>
-        <w:tc>
-          <w:tcPr>
-            <w:tcW w:type="dxa" w:w="2160"/>
-          </w:tcPr>
-          <w:p>
-            <w:r>
-              <w:t>0.0271</w:t>
-            </w:r>
-          </w:p>
-        </w:tc>
-        <w:tc>
-          <w:tcPr>
-            <w:tcW w:type="dxa" w:w="2160"/>
-          </w:tcPr>
-          <w:p>
-            <w:r>
-              <w:t>0.8350</w:t>
-            </w:r>
-          </w:p>
-        </w:tc>
-      </w:tr>
-      <w:tr>
-        <w:tc>
-          <w:tcPr>
-            <w:tcW w:type="dxa" w:w="2160"/>
-          </w:tcPr>
-          <w:p>
-            <w:r>
-              <w:t>SGDClassifier</w:t>
-            </w:r>
-          </w:p>
-        </w:tc>
-        <w:tc>
-          <w:tcPr>
-            <w:tcW w:type="dxa" w:w="2160"/>
-          </w:tcPr>
-          <w:p>
-            <w:r>
-              <w:t>0.8114</w:t>
-            </w:r>
-          </w:p>
-        </w:tc>
-        <w:tc>
-          <w:tcPr>
-            <w:tcW w:type="dxa" w:w="2160"/>
-          </w:tcPr>
-          <w:p>
-            <w:r>
-              <w:t>0.0317</w:t>
-            </w:r>
-          </w:p>
-        </w:tc>
-        <w:tc>
-          <w:tcPr>
-            <w:tcW w:type="dxa" w:w="2160"/>
-          </w:tcPr>
-          <w:p>
-            <w:r>
-              <w:t>0.8418</w:t>
-            </w:r>
-          </w:p>
-        </w:tc>
-      </w:tr>
-      <w:tr>
-        <w:tc>
-          <w:tcPr>
-            <w:tcW w:type="dxa" w:w="2160"/>
-          </w:tcPr>
-          <w:p>
-            <w:r>
-              <w:t>MLPClassifier</w:t>
-            </w:r>
-          </w:p>
-        </w:tc>
-        <w:tc>
-          <w:tcPr>
-            <w:tcW w:type="dxa" w:w="2160"/>
-          </w:tcPr>
-          <w:p>
-            <w:r>
-              <w:t>0.8092</w:t>
-            </w:r>
-          </w:p>
-        </w:tc>
-        <w:tc>
-          <w:tcPr>
-            <w:tcW w:type="dxa" w:w="2160"/>
-          </w:tcPr>
-          <w:p>
-            <w:r>
-              <w:t>0.0222</w:t>
-            </w:r>
-          </w:p>
-        </w:tc>
-        <w:tc>
-          <w:tcPr>
-            <w:tcW w:type="dxa" w:w="2160"/>
-          </w:tcPr>
-          <w:p>
-            <w:r>
-              <w:t>0.8249</w:t>
-            </w:r>
-          </w:p>
-        </w:tc>
-      </w:tr>
-      <w:tr>
-        <w:tc>
-          <w:tcPr>
-            <w:tcW w:type="dxa" w:w="2160"/>
-          </w:tcPr>
-          <w:p>
-            <w:r>
-              <w:t>LightGBM</w:t>
-            </w:r>
-          </w:p>
-        </w:tc>
-        <w:tc>
-          <w:tcPr>
-            <w:tcW w:type="dxa" w:w="2160"/>
-          </w:tcPr>
-          <w:p>
-            <w:r>
-              <w:t>0.8047</w:t>
-            </w:r>
-          </w:p>
-        </w:tc>
-        <w:tc>
-          <w:tcPr>
-            <w:tcW w:type="dxa" w:w="2160"/>
-          </w:tcPr>
-          <w:p>
-            <w:r>
-              <w:t>0.0153</w:t>
-            </w:r>
-          </w:p>
-        </w:tc>
-        <w:tc>
-          <w:tcPr>
-            <w:tcW w:type="dxa" w:w="2160"/>
-          </w:tcPr>
-          <w:p>
-            <w:r>
-              <w:t>0.8215</w:t>
-            </w:r>
-          </w:p>
-        </w:tc>
-      </w:tr>
-      <w:tr>
-        <w:tc>
-          <w:tcPr>
-            <w:tcW w:type="dxa" w:w="2160"/>
-          </w:tcPr>
-          <w:p>
-            <w:r>
-              <w:t>GradientBoosting</w:t>
-            </w:r>
-          </w:p>
-        </w:tc>
-        <w:tc>
-          <w:tcPr>
-            <w:tcW w:type="dxa" w:w="2160"/>
-          </w:tcPr>
-          <w:p>
-            <w:r>
-              <w:t>0.8036</w:t>
-            </w:r>
-          </w:p>
-        </w:tc>
-        <w:tc>
-          <w:tcPr>
-            <w:tcW w:type="dxa" w:w="2160"/>
-          </w:tcPr>
-          <w:p>
-            <w:r>
-              <w:t>0.0183</w:t>
-            </w:r>
-          </w:p>
-        </w:tc>
-        <w:tc>
-          <w:tcPr>
-            <w:tcW w:type="dxa" w:w="2160"/>
-          </w:tcPr>
-          <w:p>
-            <w:r>
-              <w:t>0.8182</w:t>
-            </w:r>
-          </w:p>
-        </w:tc>
-      </w:tr>
-      <w:tr>
-        <w:tc>
-          <w:tcPr>
-            <w:tcW w:type="dxa" w:w="2160"/>
-          </w:tcPr>
-          <w:p>
-            <w:r>
-              <w:t>XGBoost</w:t>
-            </w:r>
-          </w:p>
-        </w:tc>
-        <w:tc>
-          <w:tcPr>
-            <w:tcW w:type="dxa" w:w="2160"/>
-          </w:tcPr>
-          <w:p>
-            <w:r>
-              <w:t>0.7980</w:t>
-            </w:r>
-          </w:p>
-        </w:tc>
-        <w:tc>
-          <w:tcPr>
-            <w:tcW w:type="dxa" w:w="2160"/>
-          </w:tcPr>
-          <w:p>
-            <w:r>
-              <w:t>0.0167</w:t>
-            </w:r>
-          </w:p>
-        </w:tc>
-        <w:tc>
-          <w:tcPr>
-            <w:tcW w:type="dxa" w:w="2160"/>
-          </w:tcPr>
-          <w:p>
-            <w:r>
-              <w:t>0.8114</w:t>
-            </w:r>
-          </w:p>
-        </w:tc>
-      </w:tr>
-      <w:tr>
-        <w:tc>
-          <w:tcPr>
-            <w:tcW w:type="dxa" w:w="2160"/>
-          </w:tcPr>
-          <w:p>
-            <w:r>
-              <w:t>RandomForest</w:t>
-            </w:r>
-          </w:p>
-        </w:tc>
-        <w:tc>
-          <w:tcPr>
-            <w:tcW w:type="dxa" w:w="2160"/>
-          </w:tcPr>
-          <w:p>
-            <w:r>
-              <w:t>0.7969</w:t>
-            </w:r>
-          </w:p>
-        </w:tc>
-        <w:tc>
-          <w:tcPr>
-            <w:tcW w:type="dxa" w:w="2160"/>
-          </w:tcPr>
-          <w:p>
-            <w:r>
-              <w:t>0.0240</w:t>
-            </w:r>
-          </w:p>
-        </w:tc>
-        <w:tc>
-          <w:tcPr>
-            <w:tcW w:type="dxa" w:w="2160"/>
-          </w:tcPr>
-          <w:p>
-            <w:r>
-              <w:t>0.8215</w:t>
-            </w:r>
-          </w:p>
-        </w:tc>
-      </w:tr>
-      <w:tr>
-        <w:tc>
-          <w:tcPr>
-            <w:tcW w:type="dxa" w:w="2160"/>
-          </w:tcPr>
-          <w:p>
-            <w:r>
-              <w:t>Bagging</w:t>
-            </w:r>
-          </w:p>
-        </w:tc>
-        <w:tc>
-          <w:tcPr>
-            <w:tcW w:type="dxa" w:w="2160"/>
-          </w:tcPr>
-          <w:p>
-            <w:r>
-              <w:t>0.7969</w:t>
-            </w:r>
-          </w:p>
-        </w:tc>
-        <w:tc>
-          <w:tcPr>
-            <w:tcW w:type="dxa" w:w="2160"/>
-          </w:tcPr>
-          <w:p>
-            <w:r>
-              <w:t>0.0195</w:t>
-            </w:r>
-          </w:p>
-        </w:tc>
-        <w:tc>
-          <w:tcPr>
-            <w:tcW w:type="dxa" w:w="2160"/>
-          </w:tcPr>
-          <w:p>
-            <w:r>
-              <w:t>0.8182</w:t>
-            </w:r>
-          </w:p>
-        </w:tc>
-      </w:tr>
-      <w:tr>
-        <w:tc>
-          <w:tcPr>
-            <w:tcW w:type="dxa" w:w="2160"/>
-          </w:tcPr>
-          <w:p>
-            <w:r>
-              <w:t>ExtraTrees</w:t>
-            </w:r>
-          </w:p>
-        </w:tc>
-        <w:tc>
-          <w:tcPr>
-            <w:tcW w:type="dxa" w:w="2160"/>
-          </w:tcPr>
-          <w:p>
-            <w:r>
-              <w:t>0.7755</w:t>
-            </w:r>
-          </w:p>
-        </w:tc>
-        <w:tc>
-          <w:tcPr>
-            <w:tcW w:type="dxa" w:w="2160"/>
-          </w:tcPr>
-          <w:p>
-            <w:r>
-              <w:t>0.0231</w:t>
-            </w:r>
-          </w:p>
-        </w:tc>
-        <w:tc>
-          <w:tcPr>
-            <w:tcW w:type="dxa" w:w="2160"/>
-          </w:tcPr>
-          <w:p>
-            <w:r>
-              <w:t>0.8081</w:t>
-            </w:r>
-          </w:p>
-        </w:tc>
-      </w:tr>
-      <w:tr>
-        <w:tc>
-          <w:tcPr>
-            <w:tcW w:type="dxa" w:w="2160"/>
-          </w:tcPr>
-          <w:p>
-            <w:r>
-              <w:t>DecisionTree</w:t>
-            </w:r>
-          </w:p>
-        </w:tc>
-        <w:tc>
-          <w:tcPr>
-            <w:tcW w:type="dxa" w:w="2160"/>
-          </w:tcPr>
-          <w:p>
-            <w:r>
-              <w:t>0.7609</w:t>
-            </w:r>
-          </w:p>
-        </w:tc>
-        <w:tc>
-          <w:tcPr>
-            <w:tcW w:type="dxa" w:w="2160"/>
-          </w:tcPr>
-          <w:p>
-            <w:r>
-              <w:t>0.0198</w:t>
-            </w:r>
-          </w:p>
-        </w:tc>
-        <w:tc>
-          <w:tcPr>
-            <w:tcW w:type="dxa" w:w="2160"/>
-          </w:tcPr>
-          <w:p>
-            <w:r>
-              <w:t>0.7879</w:t>
+              <w:t>0.8000</w:t>
             </w:r>
           </w:p>
         </w:tc>
@@ -1031,7 +381,7 @@
     </w:p>
     <w:p>
       <w:r>
-        <w:t>O modelo com melhor desempenho foi o SVC, alcançando uma acurácia média de 0.8283 com desvio padrão de 0.0120.</w:t>
+        <w:t>O modelo com melhor desempenho foi o RandomForest, alcançando uma acurácia média de 0.8500 com desvio padrão de 0.0200.</w:t>
       </w:r>
     </w:p>
     <w:p>
@@ -1105,7 +455,7 @@
         <w:pStyle w:val="ListNumber"/>
       </w:pPr>
       <w:r>
-        <w:t>1. Pclass</w:t>
+        <w:t>1. age_normalized</w:t>
       </w:r>
     </w:p>
     <w:p>
@@ -1113,7 +463,7 @@
         <w:pStyle w:val="ListNumber"/>
       </w:pPr>
       <w:r>
-        <w:t>2. Sex</w:t>
+        <w:t>2. fare_log</w:t>
       </w:r>
     </w:p>
     <w:p>
@@ -1121,7 +471,7 @@
         <w:pStyle w:val="ListNumber"/>
       </w:pPr>
       <w:r>
-        <w:t>3. Age</w:t>
+        <w:t>3. family_size</w:t>
       </w:r>
     </w:p>
     <w:p>
@@ -1129,7 +479,7 @@
         <w:pStyle w:val="ListNumber"/>
       </w:pPr>
       <w:r>
-        <w:t>4. SibSp</w:t>
+        <w:t>4. title_encoded</w:t>
       </w:r>
     </w:p>
     <w:p>
@@ -1137,7 +487,7 @@
         <w:pStyle w:val="ListNumber"/>
       </w:pPr>
       <w:r>
-        <w:t>5. Parch</w:t>
+        <w:t>5. cabin_deck</w:t>
       </w:r>
     </w:p>
     <w:p>
@@ -1145,7 +495,7 @@
         <w:pStyle w:val="ListNumber"/>
       </w:pPr>
       <w:r>
-        <w:t>6. Fare</w:t>
+        <w:t>6. embarked_onehot_S</w:t>
       </w:r>
     </w:p>
     <w:p>
@@ -1153,7 +503,7 @@
         <w:pStyle w:val="ListNumber"/>
       </w:pPr>
       <w:r>
-        <w:t>7. Embarked</w:t>
+        <w:t>7. embarked_onehot_C</w:t>
       </w:r>
     </w:p>
     <w:p>
@@ -1161,7 +511,7 @@
         <w:pStyle w:val="ListNumber"/>
       </w:pPr>
       <w:r>
-        <w:t>8. FamilySize</w:t>
+        <w:t>8. embarked_onehot_Q</w:t>
       </w:r>
     </w:p>
     <w:p>
@@ -1169,7 +519,7 @@
         <w:pStyle w:val="ListNumber"/>
       </w:pPr>
       <w:r>
-        <w:t>9. IsAlone</w:t>
+        <w:t>9. sex_male</w:t>
       </w:r>
     </w:p>
     <w:p>
@@ -1177,7 +527,7 @@
         <w:pStyle w:val="ListNumber"/>
       </w:pPr>
       <w:r>
-        <w:t>10. TicketPrefix</w:t>
+        <w:t>10. pclass_1</w:t>
       </w:r>
     </w:p>
     <w:p>
@@ -1185,7 +535,7 @@
         <w:pStyle w:val="ListNumber"/>
       </w:pPr>
       <w:r>
-        <w:t>11. feat_AgeBin</w:t>
+        <w:t>11. pclass_2</w:t>
       </w:r>
     </w:p>
     <w:p>
@@ -1193,7 +543,7 @@
         <w:pStyle w:val="ListNumber"/>
       </w:pPr>
       <w:r>
-        <w:t>12. feat_FareBin</w:t>
+        <w:t>12. pclass_3</w:t>
       </w:r>
     </w:p>
     <w:p>
@@ -1201,7 +551,7 @@
         <w:pStyle w:val="ListNumber"/>
       </w:pPr>
       <w:r>
-        <w:t>13. feat_AgeCategory_v2</w:t>
+        <w:t>13. sibsp_scaled</w:t>
       </w:r>
     </w:p>
     <w:p>
@@ -1209,7 +559,7 @@
         <w:pStyle w:val="ListNumber"/>
       </w:pPr>
       <w:r>
-        <w:t>14. feat_FareCategory_v2</w:t>
+        <w:t>14. parch_scaled</w:t>
       </w:r>
     </w:p>
     <w:p>
@@ -1217,7 +567,7 @@
         <w:pStyle w:val="ListNumber"/>
       </w:pPr>
       <w:r>
-        <w:t>15. feat_Age_missing</w:t>
+        <w:t>15. age_fare_interaction</w:t>
       </w:r>
     </w:p>
     <w:p>
@@ -1225,7 +575,7 @@
         <w:pStyle w:val="ListNumber"/>
       </w:pPr>
       <w:r>
-        <w:t>16. feat_Cabin_missing</w:t>
+        <w:t>16. family_wealth_score</w:t>
       </w:r>
     </w:p>
     <w:p>
@@ -1233,7 +583,7 @@
         <w:pStyle w:val="ListNumber"/>
       </w:pPr>
       <w:r>
-        <w:t>17. feat_Embarked_missing</w:t>
+        <w:t>17. cabin_number</w:t>
       </w:r>
     </w:p>
     <w:p>
@@ -1241,7 +591,7 @@
         <w:pStyle w:val="ListNumber"/>
       </w:pPr>
       <w:r>
-        <w:t>18. feat_Fare_missing</w:t>
+        <w:t>18. ticket_prefix</w:t>
       </w:r>
     </w:p>
     <w:p>
@@ -1249,7 +599,7 @@
         <w:pStyle w:val="ListNumber"/>
       </w:pPr>
       <w:r>
-        <w:t>19. feat_Pclass_te</w:t>
+        <w:t>19. name_length</w:t>
       </w:r>
     </w:p>
     <w:p>
@@ -1257,7 +607,7 @@
         <w:pStyle w:val="ListNumber"/>
       </w:pPr>
       <w:r>
-        <w:t>20. feat_Sex_te</w:t>
+        <w:t>20. age_group</w:t>
       </w:r>
     </w:p>
     <w:p>
@@ -1265,7 +615,7 @@
         <w:pStyle w:val="ListNumber"/>
       </w:pPr>
       <w:r>
-        <w:t>21. feat_Embarked_te</w:t>
+        <w:t>21. Pclass</w:t>
       </w:r>
     </w:p>
     <w:p>
@@ -1273,7 +623,7 @@
         <w:pStyle w:val="ListNumber"/>
       </w:pPr>
       <w:r>
-        <w:t>22. feat_Title_te</w:t>
+        <w:t>22. Sex</w:t>
       </w:r>
     </w:p>
     <w:p>
@@ -1281,7 +631,7 @@
         <w:pStyle w:val="ListNumber"/>
       </w:pPr>
       <w:r>
-        <w:t>23. feat_TicketPrefix_te</w:t>
+        <w:t>23. Embarked</w:t>
       </w:r>
     </w:p>
     <w:p>
@@ -1376,7 +726,7 @@
     </w:p>
     <w:p>
       <w:r>
-        <w:t>Este trabalho demonstrou a aplicação bem-sucedida de técnicas de machine learning para análise do desastre do Titanic. O pipeline desenvolvido alcançou uma acurácia de 0.7879, identificando fatores-chave para a sobrevivência.</w:t>
+        <w:t>Este trabalho demonstrou a aplicação bem-sucedida de técnicas de machine learning para análise do desastre do Titanic. O pipeline desenvolvido alcançou uma acurácia de 0.8000, identificando fatores-chave para a sobrevivência.</w:t>
       </w:r>
     </w:p>
     <w:p>
@@ -1449,7 +799,19 @@
       <w:r>
         <w:t>```</w:t>
         <w:br/>
-        <w:t>{}</w:t>
+        <w:t>{</w:t>
+        <w:br/>
+        <w:t xml:space="preserve">  "generate_md": true,</w:t>
+        <w:br/>
+        <w:t xml:space="preserve">  "generate_docx": true,</w:t>
+        <w:br/>
+        <w:t xml:space="preserve">  "generate_pdf": true,</w:t>
+        <w:br/>
+        <w:t xml:space="preserve">  "include_calibration_plots": true,</w:t>
+        <w:br/>
+        <w:t xml:space="preserve">  "include_feature_importance": true</w:t>
+        <w:br/>
+        <w:t>}</w:t>
         <w:br/>
         <w:t>```</w:t>
       </w:r>
@@ -1559,7 +921,7 @@
     </w:p>
     <w:p>
       <w:r>
-        <w:t>Atual: 15+ modelos state-of-the-art, validação estratificada</w:t>
+        <w:t>Atual: 2+ modelos state-of-the-art, validação estratificada</w:t>
       </w:r>
     </w:p>
     <w:p>
@@ -1832,7 +1194,7 @@
           </w:tcPr>
           <w:p>
             <w:r>
-              <w:t>15</w:t>
+              <w:t>2</w:t>
             </w:r>
           </w:p>
         </w:tc>
@@ -1842,7 +1204,7 @@
           </w:tcPr>
           <w:p>
             <w:r>
-              <w:t>+9</w:t>
+              <w:t>+-4</w:t>
             </w:r>
           </w:p>
         </w:tc>
@@ -2191,7 +1553,7 @@
     </w:p>
     <w:p>
       <w:r>
-        <w:t>Relatório gerado em: 05/01/2026 00:25:57</w:t>
+        <w:t>Relatório gerado em: 17/01/2026 11:44:36</w:t>
       </w:r>
     </w:p>
     <w:p>

</xml_diff>

<commit_message>
Update training logs and metrics
</commit_message>
<xml_diff>
--- a/output/relatorios/relatorio_final.docx
+++ b/output/relatorios/relatorio_final.docx
@@ -45,7 +45,7 @@
     </w:p>
     <w:p>
       <w:r>
-        <w:t>Este relatório apresenta uma análise completa do desenvolvimento de um pipeline de machine learning para a predição de sobrevivência no desastre do Titanic. Foram treinados 2 modelos de classificação diferentes, utilizando 23 features engenheiradas a partir dos dados originais. O melhor modelo alcançou uma acurácia de 0.8500 na validação cruzada. A análise inclui pré-processamento avançado, seleção de features, comparação de algoritmos e geração de insights sobre os fatores que influenciaram a sobrevivência dos passageiros.</w:t>
+        <w:t>Este relatório apresenta uma análise completa do desenvolvimento de um pipeline de machine learning para a predição de sobrevivência no desastre do Titanic. Foram treinados 22 modelos de classificação diferentes, utilizando 28 features engenheiradas a partir dos dados originais. O melhor modelo alcançou uma acurácia de 0.8373 na validação cruzada. A análise inclui pré-processamento avançado, seleção de features, comparação de algoritmos e geração de insights sobre os fatores que influenciaram a sobrevivência dos passageiros.</w:t>
       </w:r>
     </w:p>
     <w:p>
@@ -191,6 +191,166 @@
       </w:pPr>
       <w:r>
         <w:t>2. LogisticRegression</w:t>
+      </w:r>
+    </w:p>
+    <w:p>
+      <w:pPr>
+        <w:pStyle w:val="ListNumber"/>
+      </w:pPr>
+      <w:r>
+        <w:t>3. SVC</w:t>
+      </w:r>
+    </w:p>
+    <w:p>
+      <w:pPr>
+        <w:pStyle w:val="ListNumber"/>
+      </w:pPr>
+      <w:r>
+        <w:t>4. KNeighbors</w:t>
+      </w:r>
+    </w:p>
+    <w:p>
+      <w:pPr>
+        <w:pStyle w:val="ListNumber"/>
+      </w:pPr>
+      <w:r>
+        <w:t>5. GaussianNB</w:t>
+      </w:r>
+    </w:p>
+    <w:p>
+      <w:pPr>
+        <w:pStyle w:val="ListNumber"/>
+      </w:pPr>
+      <w:r>
+        <w:t>6. MLPClassifier</w:t>
+      </w:r>
+    </w:p>
+    <w:p>
+      <w:pPr>
+        <w:pStyle w:val="ListNumber"/>
+      </w:pPr>
+      <w:r>
+        <w:t>7. GradientBoosting</w:t>
+      </w:r>
+    </w:p>
+    <w:p>
+      <w:pPr>
+        <w:pStyle w:val="ListNumber"/>
+      </w:pPr>
+      <w:r>
+        <w:t>8. ExtraTrees</w:t>
+      </w:r>
+    </w:p>
+    <w:p>
+      <w:pPr>
+        <w:pStyle w:val="ListNumber"/>
+      </w:pPr>
+      <w:r>
+        <w:t>9. AdaBoost</w:t>
+      </w:r>
+    </w:p>
+    <w:p>
+      <w:pPr>
+        <w:pStyle w:val="ListNumber"/>
+      </w:pPr>
+      <w:r>
+        <w:t>10. Bagging</w:t>
+      </w:r>
+    </w:p>
+    <w:p>
+      <w:pPr>
+        <w:pStyle w:val="ListNumber"/>
+      </w:pPr>
+      <w:r>
+        <w:t>11. SGDClassifier</w:t>
+      </w:r>
+    </w:p>
+    <w:p>
+      <w:pPr>
+        <w:pStyle w:val="ListNumber"/>
+      </w:pPr>
+      <w:r>
+        <w:t>12. RidgeClassifier</w:t>
+      </w:r>
+    </w:p>
+    <w:p>
+      <w:pPr>
+        <w:pStyle w:val="ListNumber"/>
+      </w:pPr>
+      <w:r>
+        <w:t>13. LinearSVC</w:t>
+      </w:r>
+    </w:p>
+    <w:p>
+      <w:pPr>
+        <w:pStyle w:val="ListNumber"/>
+      </w:pPr>
+      <w:r>
+        <w:t>14. DecisionTree</w:t>
+      </w:r>
+    </w:p>
+    <w:p>
+      <w:pPr>
+        <w:pStyle w:val="ListNumber"/>
+      </w:pPr>
+      <w:r>
+        <w:t>15. BernoulliNB</w:t>
+      </w:r>
+    </w:p>
+    <w:p>
+      <w:pPr>
+        <w:pStyle w:val="ListNumber"/>
+      </w:pPr>
+      <w:r>
+        <w:t>16. LinearDiscriminantAnalysis</w:t>
+      </w:r>
+    </w:p>
+    <w:p>
+      <w:pPr>
+        <w:pStyle w:val="ListNumber"/>
+      </w:pPr>
+      <w:r>
+        <w:t>17. QuadraticDiscriminantAnalysis</w:t>
+      </w:r>
+    </w:p>
+    <w:p>
+      <w:pPr>
+        <w:pStyle w:val="ListNumber"/>
+      </w:pPr>
+      <w:r>
+        <w:t>18. XGBoost</w:t>
+      </w:r>
+    </w:p>
+    <w:p>
+      <w:pPr>
+        <w:pStyle w:val="ListNumber"/>
+      </w:pPr>
+      <w:r>
+        <w:t>19. LightGBM</w:t>
+      </w:r>
+    </w:p>
+    <w:p>
+      <w:pPr>
+        <w:pStyle w:val="ListNumber"/>
+      </w:pPr>
+      <w:r>
+        <w:t>20. CatBoost</w:t>
+      </w:r>
+    </w:p>
+    <w:p>
+      <w:pPr>
+        <w:pStyle w:val="ListNumber"/>
+      </w:pPr>
+      <w:r>
+        <w:t>21. VotingEnsemble</w:t>
+      </w:r>
+    </w:p>
+    <w:p>
+      <w:pPr>
+        <w:pStyle w:val="ListNumber"/>
+      </w:pPr>
+      <w:r>
+        <w:t>22. StackingEnsemble</w:t>
       </w:r>
     </w:p>
     <w:p>
@@ -288,7 +448,7 @@
           </w:tcPr>
           <w:p>
             <w:r>
-              <w:t>RandomForest</w:t>
+              <w:t>LogisticRegression</w:t>
             </w:r>
           </w:p>
         </w:tc>
@@ -298,7 +458,7 @@
           </w:tcPr>
           <w:p>
             <w:r>
-              <w:t>0.8500</w:t>
+              <w:t>0.8373</w:t>
             </w:r>
           </w:p>
         </w:tc>
@@ -308,7 +468,7 @@
           </w:tcPr>
           <w:p>
             <w:r>
-              <w:t>0.0200</w:t>
+              <w:t>0.0079</w:t>
             </w:r>
           </w:p>
         </w:tc>
@@ -318,7 +478,7 @@
           </w:tcPr>
           <w:p>
             <w:r>
-              <w:t>0.8700</w:t>
+              <w:t>0.8485</w:t>
             </w:r>
           </w:p>
         </w:tc>
@@ -330,7 +490,7 @@
           </w:tcPr>
           <w:p>
             <w:r>
-              <w:t>LogisticRegression</w:t>
+              <w:t>LinearSVC</w:t>
             </w:r>
           </w:p>
         </w:tc>
@@ -340,7 +500,7 @@
           </w:tcPr>
           <w:p>
             <w:r>
-              <w:t>0.7800</w:t>
+              <w:t>0.8350</w:t>
             </w:r>
           </w:p>
         </w:tc>
@@ -350,7 +510,7 @@
           </w:tcPr>
           <w:p>
             <w:r>
-              <w:t>0.0300</w:t>
+              <w:t>0.0110</w:t>
             </w:r>
           </w:p>
         </w:tc>
@@ -360,7 +520,847 @@
           </w:tcPr>
           <w:p>
             <w:r>
-              <w:t>0.8000</w:t>
+              <w:t>0.8485</w:t>
+            </w:r>
+          </w:p>
+        </w:tc>
+      </w:tr>
+      <w:tr>
+        <w:tc>
+          <w:tcPr>
+            <w:tcW w:type="dxa" w:w="2160"/>
+          </w:tcPr>
+          <w:p>
+            <w:r>
+              <w:t>SVC</w:t>
+            </w:r>
+          </w:p>
+        </w:tc>
+        <w:tc>
+          <w:tcPr>
+            <w:tcW w:type="dxa" w:w="2160"/>
+          </w:tcPr>
+          <w:p>
+            <w:r>
+              <w:t>0.8339</w:t>
+            </w:r>
+          </w:p>
+        </w:tc>
+        <w:tc>
+          <w:tcPr>
+            <w:tcW w:type="dxa" w:w="2160"/>
+          </w:tcPr>
+          <w:p>
+            <w:r>
+              <w:t>0.0088</w:t>
+            </w:r>
+          </w:p>
+        </w:tc>
+        <w:tc>
+          <w:tcPr>
+            <w:tcW w:type="dxa" w:w="2160"/>
+          </w:tcPr>
+          <w:p>
+            <w:r>
+              <w:t>0.8418</w:t>
+            </w:r>
+          </w:p>
+        </w:tc>
+      </w:tr>
+      <w:tr>
+        <w:tc>
+          <w:tcPr>
+            <w:tcW w:type="dxa" w:w="2160"/>
+          </w:tcPr>
+          <w:p>
+            <w:r>
+              <w:t>RidgeClassifier</w:t>
+            </w:r>
+          </w:p>
+        </w:tc>
+        <w:tc>
+          <w:tcPr>
+            <w:tcW w:type="dxa" w:w="2160"/>
+          </w:tcPr>
+          <w:p>
+            <w:r>
+              <w:t>0.8316</w:t>
+            </w:r>
+          </w:p>
+        </w:tc>
+        <w:tc>
+          <w:tcPr>
+            <w:tcW w:type="dxa" w:w="2160"/>
+          </w:tcPr>
+          <w:p>
+            <w:r>
+              <w:t>0.0073</w:t>
+            </w:r>
+          </w:p>
+        </w:tc>
+        <w:tc>
+          <w:tcPr>
+            <w:tcW w:type="dxa" w:w="2160"/>
+          </w:tcPr>
+          <w:p>
+            <w:r>
+              <w:t>0.8384</w:t>
+            </w:r>
+          </w:p>
+        </w:tc>
+      </w:tr>
+      <w:tr>
+        <w:tc>
+          <w:tcPr>
+            <w:tcW w:type="dxa" w:w="2160"/>
+          </w:tcPr>
+          <w:p>
+            <w:r>
+              <w:t>VotingEnsemble</w:t>
+            </w:r>
+          </w:p>
+        </w:tc>
+        <w:tc>
+          <w:tcPr>
+            <w:tcW w:type="dxa" w:w="2160"/>
+          </w:tcPr>
+          <w:p>
+            <w:r>
+              <w:t>0.8316</w:t>
+            </w:r>
+          </w:p>
+        </w:tc>
+        <w:tc>
+          <w:tcPr>
+            <w:tcW w:type="dxa" w:w="2160"/>
+          </w:tcPr>
+          <w:p>
+            <w:r>
+              <w:t>0.0099</w:t>
+            </w:r>
+          </w:p>
+        </w:tc>
+        <w:tc>
+          <w:tcPr>
+            <w:tcW w:type="dxa" w:w="2160"/>
+          </w:tcPr>
+          <w:p>
+            <w:r>
+              <w:t>0.8418</w:t>
+            </w:r>
+          </w:p>
+        </w:tc>
+      </w:tr>
+      <w:tr>
+        <w:tc>
+          <w:tcPr>
+            <w:tcW w:type="dxa" w:w="2160"/>
+          </w:tcPr>
+          <w:p>
+            <w:r>
+              <w:t>SGDClassifier</w:t>
+            </w:r>
+          </w:p>
+        </w:tc>
+        <w:tc>
+          <w:tcPr>
+            <w:tcW w:type="dxa" w:w="2160"/>
+          </w:tcPr>
+          <w:p>
+            <w:r>
+              <w:t>0.8294</w:t>
+            </w:r>
+          </w:p>
+        </w:tc>
+        <w:tc>
+          <w:tcPr>
+            <w:tcW w:type="dxa" w:w="2160"/>
+          </w:tcPr>
+          <w:p>
+            <w:r>
+              <w:t>0.0088</w:t>
+            </w:r>
+          </w:p>
+        </w:tc>
+        <w:tc>
+          <w:tcPr>
+            <w:tcW w:type="dxa" w:w="2160"/>
+          </w:tcPr>
+          <w:p>
+            <w:r>
+              <w:t>0.8418</w:t>
+            </w:r>
+          </w:p>
+        </w:tc>
+      </w:tr>
+      <w:tr>
+        <w:tc>
+          <w:tcPr>
+            <w:tcW w:type="dxa" w:w="2160"/>
+          </w:tcPr>
+          <w:p>
+            <w:r>
+              <w:t>CatBoost</w:t>
+            </w:r>
+          </w:p>
+        </w:tc>
+        <w:tc>
+          <w:tcPr>
+            <w:tcW w:type="dxa" w:w="2160"/>
+          </w:tcPr>
+          <w:p>
+            <w:r>
+              <w:t>0.8283</w:t>
+            </w:r>
+          </w:p>
+        </w:tc>
+        <w:tc>
+          <w:tcPr>
+            <w:tcW w:type="dxa" w:w="2160"/>
+          </w:tcPr>
+          <w:p>
+            <w:r>
+              <w:t>0.0145</w:t>
+            </w:r>
+          </w:p>
+        </w:tc>
+        <w:tc>
+          <w:tcPr>
+            <w:tcW w:type="dxa" w:w="2160"/>
+          </w:tcPr>
+          <w:p>
+            <w:r>
+              <w:t>0.8418</w:t>
+            </w:r>
+          </w:p>
+        </w:tc>
+      </w:tr>
+      <w:tr>
+        <w:tc>
+          <w:tcPr>
+            <w:tcW w:type="dxa" w:w="2160"/>
+          </w:tcPr>
+          <w:p>
+            <w:r>
+              <w:t>StackingEnsemble</w:t>
+            </w:r>
+          </w:p>
+        </w:tc>
+        <w:tc>
+          <w:tcPr>
+            <w:tcW w:type="dxa" w:w="2160"/>
+          </w:tcPr>
+          <w:p>
+            <w:r>
+              <w:t>0.8283</w:t>
+            </w:r>
+          </w:p>
+        </w:tc>
+        <w:tc>
+          <w:tcPr>
+            <w:tcW w:type="dxa" w:w="2160"/>
+          </w:tcPr>
+          <w:p>
+            <w:r>
+              <w:t>0.0099</w:t>
+            </w:r>
+          </w:p>
+        </w:tc>
+        <w:tc>
+          <w:tcPr>
+            <w:tcW w:type="dxa" w:w="2160"/>
+          </w:tcPr>
+          <w:p>
+            <w:r>
+              <w:t>0.8384</w:t>
+            </w:r>
+          </w:p>
+        </w:tc>
+      </w:tr>
+      <w:tr>
+        <w:tc>
+          <w:tcPr>
+            <w:tcW w:type="dxa" w:w="2160"/>
+          </w:tcPr>
+          <w:p>
+            <w:r>
+              <w:t>RandomForest</w:t>
+            </w:r>
+          </w:p>
+        </w:tc>
+        <w:tc>
+          <w:tcPr>
+            <w:tcW w:type="dxa" w:w="2160"/>
+          </w:tcPr>
+          <w:p>
+            <w:r>
+              <w:t>0.8260</w:t>
+            </w:r>
+          </w:p>
+        </w:tc>
+        <w:tc>
+          <w:tcPr>
+            <w:tcW w:type="dxa" w:w="2160"/>
+          </w:tcPr>
+          <w:p>
+            <w:r>
+              <w:t>0.0084</w:t>
+            </w:r>
+          </w:p>
+        </w:tc>
+        <w:tc>
+          <w:tcPr>
+            <w:tcW w:type="dxa" w:w="2160"/>
+          </w:tcPr>
+          <w:p>
+            <w:r>
+              <w:t>0.8350</w:t>
+            </w:r>
+          </w:p>
+        </w:tc>
+      </w:tr>
+      <w:tr>
+        <w:tc>
+          <w:tcPr>
+            <w:tcW w:type="dxa" w:w="2160"/>
+          </w:tcPr>
+          <w:p>
+            <w:r>
+              <w:t>GradientBoosting</w:t>
+            </w:r>
+          </w:p>
+        </w:tc>
+        <w:tc>
+          <w:tcPr>
+            <w:tcW w:type="dxa" w:w="2160"/>
+          </w:tcPr>
+          <w:p>
+            <w:r>
+              <w:t>0.8238</w:t>
+            </w:r>
+          </w:p>
+        </w:tc>
+        <w:tc>
+          <w:tcPr>
+            <w:tcW w:type="dxa" w:w="2160"/>
+          </w:tcPr>
+          <w:p>
+            <w:r>
+              <w:t>0.0161</w:t>
+            </w:r>
+          </w:p>
+        </w:tc>
+        <w:tc>
+          <w:tcPr>
+            <w:tcW w:type="dxa" w:w="2160"/>
+          </w:tcPr>
+          <w:p>
+            <w:r>
+              <w:t>0.8384</w:t>
+            </w:r>
+          </w:p>
+        </w:tc>
+      </w:tr>
+      <w:tr>
+        <w:tc>
+          <w:tcPr>
+            <w:tcW w:type="dxa" w:w="2160"/>
+          </w:tcPr>
+          <w:p>
+            <w:r>
+              <w:t>XGBoost</w:t>
+            </w:r>
+          </w:p>
+        </w:tc>
+        <w:tc>
+          <w:tcPr>
+            <w:tcW w:type="dxa" w:w="2160"/>
+          </w:tcPr>
+          <w:p>
+            <w:r>
+              <w:t>0.8215</w:t>
+            </w:r>
+          </w:p>
+        </w:tc>
+        <w:tc>
+          <w:tcPr>
+            <w:tcW w:type="dxa" w:w="2160"/>
+          </w:tcPr>
+          <w:p>
+            <w:r>
+              <w:t>0.0287</w:t>
+            </w:r>
+          </w:p>
+        </w:tc>
+        <w:tc>
+          <w:tcPr>
+            <w:tcW w:type="dxa" w:w="2160"/>
+          </w:tcPr>
+          <w:p>
+            <w:r>
+              <w:t>0.8451</w:t>
+            </w:r>
+          </w:p>
+        </w:tc>
+      </w:tr>
+      <w:tr>
+        <w:tc>
+          <w:tcPr>
+            <w:tcW w:type="dxa" w:w="2160"/>
+          </w:tcPr>
+          <w:p>
+            <w:r>
+              <w:t>ExtraTrees</w:t>
+            </w:r>
+          </w:p>
+        </w:tc>
+        <w:tc>
+          <w:tcPr>
+            <w:tcW w:type="dxa" w:w="2160"/>
+          </w:tcPr>
+          <w:p>
+            <w:r>
+              <w:t>0.8193</w:t>
+            </w:r>
+          </w:p>
+        </w:tc>
+        <w:tc>
+          <w:tcPr>
+            <w:tcW w:type="dxa" w:w="2160"/>
+          </w:tcPr>
+          <w:p>
+            <w:r>
+              <w:t>0.0063</w:t>
+            </w:r>
+          </w:p>
+        </w:tc>
+        <w:tc>
+          <w:tcPr>
+            <w:tcW w:type="dxa" w:w="2160"/>
+          </w:tcPr>
+          <w:p>
+            <w:r>
+              <w:t>0.8283</w:t>
+            </w:r>
+          </w:p>
+        </w:tc>
+      </w:tr>
+      <w:tr>
+        <w:tc>
+          <w:tcPr>
+            <w:tcW w:type="dxa" w:w="2160"/>
+          </w:tcPr>
+          <w:p>
+            <w:r>
+              <w:t>AdaBoost</w:t>
+            </w:r>
+          </w:p>
+        </w:tc>
+        <w:tc>
+          <w:tcPr>
+            <w:tcW w:type="dxa" w:w="2160"/>
+          </w:tcPr>
+          <w:p>
+            <w:r>
+              <w:t>0.8182</w:t>
+            </w:r>
+          </w:p>
+        </w:tc>
+        <w:tc>
+          <w:tcPr>
+            <w:tcW w:type="dxa" w:w="2160"/>
+          </w:tcPr>
+          <w:p>
+            <w:r>
+              <w:t>0.0073</w:t>
+            </w:r>
+          </w:p>
+        </w:tc>
+        <w:tc>
+          <w:tcPr>
+            <w:tcW w:type="dxa" w:w="2160"/>
+          </w:tcPr>
+          <w:p>
+            <w:r>
+              <w:t>0.8283</w:t>
+            </w:r>
+          </w:p>
+        </w:tc>
+      </w:tr>
+      <w:tr>
+        <w:tc>
+          <w:tcPr>
+            <w:tcW w:type="dxa" w:w="2160"/>
+          </w:tcPr>
+          <w:p>
+            <w:r>
+              <w:t>Bagging</w:t>
+            </w:r>
+          </w:p>
+        </w:tc>
+        <w:tc>
+          <w:tcPr>
+            <w:tcW w:type="dxa" w:w="2160"/>
+          </w:tcPr>
+          <w:p>
+            <w:r>
+              <w:t>0.8171</w:t>
+            </w:r>
+          </w:p>
+        </w:tc>
+        <w:tc>
+          <w:tcPr>
+            <w:tcW w:type="dxa" w:w="2160"/>
+          </w:tcPr>
+          <w:p>
+            <w:r>
+              <w:t>0.0151</w:t>
+            </w:r>
+          </w:p>
+        </w:tc>
+        <w:tc>
+          <w:tcPr>
+            <w:tcW w:type="dxa" w:w="2160"/>
+          </w:tcPr>
+          <w:p>
+            <w:r>
+              <w:t>0.8384</w:t>
+            </w:r>
+          </w:p>
+        </w:tc>
+      </w:tr>
+      <w:tr>
+        <w:tc>
+          <w:tcPr>
+            <w:tcW w:type="dxa" w:w="2160"/>
+          </w:tcPr>
+          <w:p>
+            <w:r>
+              <w:t>LightGBM</w:t>
+            </w:r>
+          </w:p>
+        </w:tc>
+        <w:tc>
+          <w:tcPr>
+            <w:tcW w:type="dxa" w:w="2160"/>
+          </w:tcPr>
+          <w:p>
+            <w:r>
+              <w:t>0.8159</w:t>
+            </w:r>
+          </w:p>
+        </w:tc>
+        <w:tc>
+          <w:tcPr>
+            <w:tcW w:type="dxa" w:w="2160"/>
+          </w:tcPr>
+          <w:p>
+            <w:r>
+              <w:t>0.0294</w:t>
+            </w:r>
+          </w:p>
+        </w:tc>
+        <w:tc>
+          <w:tcPr>
+            <w:tcW w:type="dxa" w:w="2160"/>
+          </w:tcPr>
+          <w:p>
+            <w:r>
+              <w:t>0.8384</w:t>
+            </w:r>
+          </w:p>
+        </w:tc>
+      </w:tr>
+      <w:tr>
+        <w:tc>
+          <w:tcPr>
+            <w:tcW w:type="dxa" w:w="2160"/>
+          </w:tcPr>
+          <w:p>
+            <w:r>
+              <w:t>MLPClassifier</w:t>
+            </w:r>
+          </w:p>
+        </w:tc>
+        <w:tc>
+          <w:tcPr>
+            <w:tcW w:type="dxa" w:w="2160"/>
+          </w:tcPr>
+          <w:p>
+            <w:r>
+              <w:t>0.8103</w:t>
+            </w:r>
+          </w:p>
+        </w:tc>
+        <w:tc>
+          <w:tcPr>
+            <w:tcW w:type="dxa" w:w="2160"/>
+          </w:tcPr>
+          <w:p>
+            <w:r>
+              <w:t>0.0260</w:t>
+            </w:r>
+          </w:p>
+        </w:tc>
+        <w:tc>
+          <w:tcPr>
+            <w:tcW w:type="dxa" w:w="2160"/>
+          </w:tcPr>
+          <w:p>
+            <w:r>
+              <w:t>0.8350</w:t>
+            </w:r>
+          </w:p>
+        </w:tc>
+      </w:tr>
+      <w:tr>
+        <w:tc>
+          <w:tcPr>
+            <w:tcW w:type="dxa" w:w="2160"/>
+          </w:tcPr>
+          <w:p>
+            <w:r>
+              <w:t>BernoulliNB</w:t>
+            </w:r>
+          </w:p>
+        </w:tc>
+        <w:tc>
+          <w:tcPr>
+            <w:tcW w:type="dxa" w:w="2160"/>
+          </w:tcPr>
+          <w:p>
+            <w:r>
+              <w:t>0.8103</w:t>
+            </w:r>
+          </w:p>
+        </w:tc>
+        <w:tc>
+          <w:tcPr>
+            <w:tcW w:type="dxa" w:w="2160"/>
+          </w:tcPr>
+          <w:p>
+            <w:r>
+              <w:t>0.0278</w:t>
+            </w:r>
+          </w:p>
+        </w:tc>
+        <w:tc>
+          <w:tcPr>
+            <w:tcW w:type="dxa" w:w="2160"/>
+          </w:tcPr>
+          <w:p>
+            <w:r>
+              <w:t>0.8316</w:t>
+            </w:r>
+          </w:p>
+        </w:tc>
+      </w:tr>
+      <w:tr>
+        <w:tc>
+          <w:tcPr>
+            <w:tcW w:type="dxa" w:w="2160"/>
+          </w:tcPr>
+          <w:p>
+            <w:r>
+              <w:t>LinearDiscriminantAnalysis</w:t>
+            </w:r>
+          </w:p>
+        </w:tc>
+        <w:tc>
+          <w:tcPr>
+            <w:tcW w:type="dxa" w:w="2160"/>
+          </w:tcPr>
+          <w:p>
+            <w:r>
+              <w:t>0.8103</w:t>
+            </w:r>
+          </w:p>
+        </w:tc>
+        <w:tc>
+          <w:tcPr>
+            <w:tcW w:type="dxa" w:w="2160"/>
+          </w:tcPr>
+          <w:p>
+            <w:r>
+              <w:t>0.0289</w:t>
+            </w:r>
+          </w:p>
+        </w:tc>
+        <w:tc>
+          <w:tcPr>
+            <w:tcW w:type="dxa" w:w="2160"/>
+          </w:tcPr>
+          <w:p>
+            <w:r>
+              <w:t>0.8451</w:t>
+            </w:r>
+          </w:p>
+        </w:tc>
+      </w:tr>
+      <w:tr>
+        <w:tc>
+          <w:tcPr>
+            <w:tcW w:type="dxa" w:w="2160"/>
+          </w:tcPr>
+          <w:p>
+            <w:r>
+              <w:t>KNeighbors</w:t>
+            </w:r>
+          </w:p>
+        </w:tc>
+        <w:tc>
+          <w:tcPr>
+            <w:tcW w:type="dxa" w:w="2160"/>
+          </w:tcPr>
+          <w:p>
+            <w:r>
+              <w:t>0.8047</w:t>
+            </w:r>
+          </w:p>
+        </w:tc>
+        <w:tc>
+          <w:tcPr>
+            <w:tcW w:type="dxa" w:w="2160"/>
+          </w:tcPr>
+          <w:p>
+            <w:r>
+              <w:t>0.0172</w:t>
+            </w:r>
+          </w:p>
+        </w:tc>
+        <w:tc>
+          <w:tcPr>
+            <w:tcW w:type="dxa" w:w="2160"/>
+          </w:tcPr>
+          <w:p>
+            <w:r>
+              <w:t>0.8283</w:t>
+            </w:r>
+          </w:p>
+        </w:tc>
+      </w:tr>
+      <w:tr>
+        <w:tc>
+          <w:tcPr>
+            <w:tcW w:type="dxa" w:w="2160"/>
+          </w:tcPr>
+          <w:p>
+            <w:r>
+              <w:t>DecisionTree</w:t>
+            </w:r>
+          </w:p>
+        </w:tc>
+        <w:tc>
+          <w:tcPr>
+            <w:tcW w:type="dxa" w:w="2160"/>
+          </w:tcPr>
+          <w:p>
+            <w:r>
+              <w:t>0.8036</w:t>
+            </w:r>
+          </w:p>
+        </w:tc>
+        <w:tc>
+          <w:tcPr>
+            <w:tcW w:type="dxa" w:w="2160"/>
+          </w:tcPr>
+          <w:p>
+            <w:r>
+              <w:t>0.0161</w:t>
+            </w:r>
+          </w:p>
+        </w:tc>
+        <w:tc>
+          <w:tcPr>
+            <w:tcW w:type="dxa" w:w="2160"/>
+          </w:tcPr>
+          <w:p>
+            <w:r>
+              <w:t>0.8182</w:t>
+            </w:r>
+          </w:p>
+        </w:tc>
+      </w:tr>
+      <w:tr>
+        <w:tc>
+          <w:tcPr>
+            <w:tcW w:type="dxa" w:w="2160"/>
+          </w:tcPr>
+          <w:p>
+            <w:r>
+              <w:t>QuadraticDiscriminantAnalysis</w:t>
+            </w:r>
+          </w:p>
+        </w:tc>
+        <w:tc>
+          <w:tcPr>
+            <w:tcW w:type="dxa" w:w="2160"/>
+          </w:tcPr>
+          <w:p>
+            <w:r>
+              <w:t>0.7172</w:t>
+            </w:r>
+          </w:p>
+        </w:tc>
+        <w:tc>
+          <w:tcPr>
+            <w:tcW w:type="dxa" w:w="2160"/>
+          </w:tcPr>
+          <w:p>
+            <w:r>
+              <w:t>0.0172</w:t>
+            </w:r>
+          </w:p>
+        </w:tc>
+        <w:tc>
+          <w:tcPr>
+            <w:tcW w:type="dxa" w:w="2160"/>
+          </w:tcPr>
+          <w:p>
+            <w:r>
+              <w:t>0.7340</w:t>
+            </w:r>
+          </w:p>
+        </w:tc>
+      </w:tr>
+      <w:tr>
+        <w:tc>
+          <w:tcPr>
+            <w:tcW w:type="dxa" w:w="2160"/>
+          </w:tcPr>
+          <w:p>
+            <w:r>
+              <w:t>GaussianNB</w:t>
+            </w:r>
+          </w:p>
+        </w:tc>
+        <w:tc>
+          <w:tcPr>
+            <w:tcW w:type="dxa" w:w="2160"/>
+          </w:tcPr>
+          <w:p>
+            <w:r>
+              <w:t>0.6049</w:t>
+            </w:r>
+          </w:p>
+        </w:tc>
+        <w:tc>
+          <w:tcPr>
+            <w:tcW w:type="dxa" w:w="2160"/>
+          </w:tcPr>
+          <w:p>
+            <w:r>
+              <w:t>0.0141</w:t>
+            </w:r>
+          </w:p>
+        </w:tc>
+        <w:tc>
+          <w:tcPr>
+            <w:tcW w:type="dxa" w:w="2160"/>
+          </w:tcPr>
+          <w:p>
+            <w:r>
+              <w:t>0.6195</w:t>
             </w:r>
           </w:p>
         </w:tc>
@@ -381,7 +1381,7 @@
     </w:p>
     <w:p>
       <w:r>
-        <w:t>O modelo com melhor desempenho foi o RandomForest, alcançando uma acurácia média de 0.8500 com desvio padrão de 0.0200.</w:t>
+        <w:t>O modelo com melhor desempenho foi o LogisticRegression, alcançando uma acurácia média de 0.8373 com desvio padrão de 0.0079.</w:t>
       </w:r>
     </w:p>
     <w:p>
@@ -447,7 +1447,7 @@
     </w:p>
     <w:p>
       <w:r>
-        <w:t>Foram criadas 23 features a partir dos dados originais:</w:t>
+        <w:t>Foram criadas 28 features a partir dos dados originais:</w:t>
       </w:r>
     </w:p>
     <w:p>
@@ -455,7 +1455,7 @@
         <w:pStyle w:val="ListNumber"/>
       </w:pPr>
       <w:r>
-        <w:t>1. age_normalized</w:t>
+        <w:t>1. Pclass</w:t>
       </w:r>
     </w:p>
     <w:p>
@@ -463,7 +1463,7 @@
         <w:pStyle w:val="ListNumber"/>
       </w:pPr>
       <w:r>
-        <w:t>2. fare_log</w:t>
+        <w:t>2. Name</w:t>
       </w:r>
     </w:p>
     <w:p>
@@ -471,7 +1471,7 @@
         <w:pStyle w:val="ListNumber"/>
       </w:pPr>
       <w:r>
-        <w:t>3. family_size</w:t>
+        <w:t>3. Sex</w:t>
       </w:r>
     </w:p>
     <w:p>
@@ -479,7 +1479,7 @@
         <w:pStyle w:val="ListNumber"/>
       </w:pPr>
       <w:r>
-        <w:t>4. title_encoded</w:t>
+        <w:t>4. Age</w:t>
       </w:r>
     </w:p>
     <w:p>
@@ -487,7 +1487,7 @@
         <w:pStyle w:val="ListNumber"/>
       </w:pPr>
       <w:r>
-        <w:t>5. cabin_deck</w:t>
+        <w:t>5. SibSp</w:t>
       </w:r>
     </w:p>
     <w:p>
@@ -495,7 +1495,7 @@
         <w:pStyle w:val="ListNumber"/>
       </w:pPr>
       <w:r>
-        <w:t>6. embarked_onehot_S</w:t>
+        <w:t>6. Parch</w:t>
       </w:r>
     </w:p>
     <w:p>
@@ -503,7 +1503,7 @@
         <w:pStyle w:val="ListNumber"/>
       </w:pPr>
       <w:r>
-        <w:t>7. embarked_onehot_C</w:t>
+        <w:t>7. Ticket</w:t>
       </w:r>
     </w:p>
     <w:p>
@@ -511,7 +1511,7 @@
         <w:pStyle w:val="ListNumber"/>
       </w:pPr>
       <w:r>
-        <w:t>8. embarked_onehot_Q</w:t>
+        <w:t>8. Fare</w:t>
       </w:r>
     </w:p>
     <w:p>
@@ -519,7 +1519,7 @@
         <w:pStyle w:val="ListNumber"/>
       </w:pPr>
       <w:r>
-        <w:t>9. sex_male</w:t>
+        <w:t>9. Cabin</w:t>
       </w:r>
     </w:p>
     <w:p>
@@ -527,7 +1527,7 @@
         <w:pStyle w:val="ListNumber"/>
       </w:pPr>
       <w:r>
-        <w:t>10. pclass_1</w:t>
+        <w:t>10. Embarked</w:t>
       </w:r>
     </w:p>
     <w:p>
@@ -535,7 +1535,7 @@
         <w:pStyle w:val="ListNumber"/>
       </w:pPr>
       <w:r>
-        <w:t>11. pclass_2</w:t>
+        <w:t>11. Title</w:t>
       </w:r>
     </w:p>
     <w:p>
@@ -543,7 +1543,7 @@
         <w:pStyle w:val="ListNumber"/>
       </w:pPr>
       <w:r>
-        <w:t>12. pclass_3</w:t>
+        <w:t>12. Title_Group</w:t>
       </w:r>
     </w:p>
     <w:p>
@@ -551,7 +1551,7 @@
         <w:pStyle w:val="ListNumber"/>
       </w:pPr>
       <w:r>
-        <w:t>13. sibsp_scaled</w:t>
+        <w:t>13. FamilySize</w:t>
       </w:r>
     </w:p>
     <w:p>
@@ -559,7 +1559,7 @@
         <w:pStyle w:val="ListNumber"/>
       </w:pPr>
       <w:r>
-        <w:t>14. parch_scaled</w:t>
+        <w:t>14. IsAlone</w:t>
       </w:r>
     </w:p>
     <w:p>
@@ -567,7 +1567,7 @@
         <w:pStyle w:val="ListNumber"/>
       </w:pPr>
       <w:r>
-        <w:t>15. age_fare_interaction</w:t>
+        <w:t>15. AgeGroup</w:t>
       </w:r>
     </w:p>
     <w:p>
@@ -575,7 +1575,7 @@
         <w:pStyle w:val="ListNumber"/>
       </w:pPr>
       <w:r>
-        <w:t>16. family_wealth_score</w:t>
+        <w:t>16. FareGroup</w:t>
       </w:r>
     </w:p>
     <w:p>
@@ -583,7 +1583,7 @@
         <w:pStyle w:val="ListNumber"/>
       </w:pPr>
       <w:r>
-        <w:t>17. cabin_number</w:t>
+        <w:t>17. CabinDeck</w:t>
       </w:r>
     </w:p>
     <w:p>
@@ -591,7 +1591,7 @@
         <w:pStyle w:val="ListNumber"/>
       </w:pPr>
       <w:r>
-        <w:t>18. ticket_prefix</w:t>
+        <w:t>18. TicketFreq</w:t>
       </w:r>
     </w:p>
     <w:p>
@@ -599,7 +1599,7 @@
         <w:pStyle w:val="ListNumber"/>
       </w:pPr>
       <w:r>
-        <w:t>19. name_length</w:t>
+        <w:t>19. Age*Pclass</w:t>
       </w:r>
     </w:p>
     <w:p>
@@ -607,7 +1607,7 @@
         <w:pStyle w:val="ListNumber"/>
       </w:pPr>
       <w:r>
-        <w:t>20. age_group</w:t>
+        <w:t>20. FarePerPerson</w:t>
       </w:r>
     </w:p>
     <w:p>
@@ -615,7 +1615,7 @@
         <w:pStyle w:val="ListNumber"/>
       </w:pPr>
       <w:r>
-        <w:t>21. Pclass</w:t>
+        <w:t>21. Title*Pclass</w:t>
       </w:r>
     </w:p>
     <w:p>
@@ -623,7 +1623,7 @@
         <w:pStyle w:val="ListNumber"/>
       </w:pPr>
       <w:r>
-        <w:t>22. Sex</w:t>
+        <w:t>22. Age*Sex</w:t>
       </w:r>
     </w:p>
     <w:p>
@@ -631,7 +1631,47 @@
         <w:pStyle w:val="ListNumber"/>
       </w:pPr>
       <w:r>
-        <w:t>23. Embarked</w:t>
+        <w:t>23. FamilySizeCat</w:t>
+      </w:r>
+    </w:p>
+    <w:p>
+      <w:pPr>
+        <w:pStyle w:val="ListNumber"/>
+      </w:pPr>
+      <w:r>
+        <w:t>24. Age^2</w:t>
+      </w:r>
+    </w:p>
+    <w:p>
+      <w:pPr>
+        <w:pStyle w:val="ListNumber"/>
+      </w:pPr>
+      <w:r>
+        <w:t>25. Fare^2</w:t>
+      </w:r>
+    </w:p>
+    <w:p>
+      <w:pPr>
+        <w:pStyle w:val="ListNumber"/>
+      </w:pPr>
+      <w:r>
+        <w:t>26. Age*Fare</w:t>
+      </w:r>
+    </w:p>
+    <w:p>
+      <w:pPr>
+        <w:pStyle w:val="ListNumber"/>
+      </w:pPr>
+      <w:r>
+        <w:t>27. Title_encoded</w:t>
+      </w:r>
+    </w:p>
+    <w:p>
+      <w:pPr>
+        <w:pStyle w:val="ListNumber"/>
+      </w:pPr>
+      <w:r>
+        <w:t>28. CabinDeck_encoded</w:t>
       </w:r>
     </w:p>
     <w:p>
@@ -726,7 +1766,7 @@
     </w:p>
     <w:p>
       <w:r>
-        <w:t>Este trabalho demonstrou a aplicação bem-sucedida de técnicas de machine learning para análise do desastre do Titanic. O pipeline desenvolvido alcançou uma acurácia de 0.8000, identificando fatores-chave para a sobrevivência.</w:t>
+        <w:t>Este trabalho demonstrou a aplicação bem-sucedida de técnicas de machine learning para análise do desastre do Titanic. O pipeline desenvolvido alcançou uma acurácia de 0.6195, identificando fatores-chave para a sobrevivência.</w:t>
       </w:r>
     </w:p>
     <w:p>
@@ -801,15 +1841,55 @@
         <w:br/>
         <w:t>{</w:t>
         <w:br/>
-        <w:t xml:space="preserve">  "generate_md": true,</w:t>
+        <w:t xml:space="preserve">  "debug_mode": true,</w:t>
         <w:br/>
-        <w:t xml:space="preserve">  "generate_docx": true,</w:t>
+        <w:t xml:space="preserve">  "random_state": 25,</w:t>
         <w:br/>
-        <w:t xml:space="preserve">  "generate_pdf": true,</w:t>
+        <w:t xml:space="preserve">  "parallel_jobs": 1,</w:t>
         <w:br/>
-        <w:t xml:space="preserve">  "include_calibration_plots": true,</w:t>
+        <w:t xml:space="preserve">  "cv_folds": 3,</w:t>
         <w:br/>
-        <w:t xml:space="preserve">  "include_feature_importance": true</w:t>
+        <w:t xml:space="preserve">  "cache_enabled": false,</w:t>
+        <w:br/>
+        <w:t xml:space="preserve">  "fast_mode": true,</w:t>
+        <w:br/>
+        <w:t xml:space="preserve">  "feature_selection": false,</w:t>
+        <w:br/>
+        <w:t xml:space="preserve">  "run_smoke_tests": true,</w:t>
+        <w:br/>
+        <w:t xml:space="preserve">  "optuna_trials": 0,</w:t>
+        <w:br/>
+        <w:t xml:space="preserve">  "use_knn_imputation": true,</w:t>
+        <w:br/>
+        <w:t xml:space="preserve">  "enhanced_balance": false,</w:t>
+        <w:br/>
+        <w:t xml:space="preserve">  "generate_all_plots": true,</w:t>
+        <w:br/>
+        <w:t xml:space="preserve">  "log_level": 20,</w:t>
+        <w:br/>
+        <w:t xml:space="preserve">  "max_features_for_shap": 100,</w:t>
+        <w:br/>
+        <w:t xml:space="preserve">  "kfold_te_splits": 5,</w:t>
+        <w:br/>
+        <w:t xml:space="preserve">  "smote_k": 5,</w:t>
+        <w:br/>
+        <w:t xml:space="preserve">  "smote_strategy": "auto",</w:t>
+        <w:br/>
+        <w:t xml:space="preserve">  "calibration_method": "isotonic",</w:t>
+        <w:br/>
+        <w:t xml:space="preserve">  "calibration_cv": 3,</w:t>
+        <w:br/>
+        <w:t xml:space="preserve">  "permutation_repeats": 5,</w:t>
+        <w:br/>
+        <w:t xml:space="preserve">  "randomized_n_iter": 100,</w:t>
+        <w:br/>
+        <w:t xml:space="preserve">  "report_include_images": true,</w:t>
+        <w:br/>
+        <w:t xml:space="preserve">  "selection_threshold": 0.01,</w:t>
+        <w:br/>
+        <w:t xml:space="preserve">  "te_prior": 10,</w:t>
+        <w:br/>
+        <w:t xml:space="preserve">  "use_optuna": false</w:t>
         <w:br/>
         <w:t>}</w:t>
         <w:br/>
@@ -875,7 +1955,7 @@
     </w:p>
     <w:p>
       <w:r>
-        <w:t>Atual: 23+ features avançadas</w:t>
+        <w:t>Atual: 28+ features avançadas</w:t>
       </w:r>
     </w:p>
     <w:p>
@@ -921,7 +2001,7 @@
     </w:p>
     <w:p>
       <w:r>
-        <w:t>Atual: 2+ modelos state-of-the-art, validação estratificada</w:t>
+        <w:t>Atual: 22+ modelos state-of-the-art, validação estratificada</w:t>
       </w:r>
     </w:p>
     <w:p>
@@ -1152,7 +2232,7 @@
           </w:tcPr>
           <w:p>
             <w:r>
-              <w:t>23</w:t>
+              <w:t>28</w:t>
             </w:r>
           </w:p>
         </w:tc>
@@ -1162,7 +2242,7 @@
           </w:tcPr>
           <w:p>
             <w:r>
-              <w:t>+15</w:t>
+              <w:t>+20</w:t>
             </w:r>
           </w:p>
         </w:tc>
@@ -1194,7 +2274,7 @@
           </w:tcPr>
           <w:p>
             <w:r>
-              <w:t>2</w:t>
+              <w:t>22</w:t>
             </w:r>
           </w:p>
         </w:tc>
@@ -1204,7 +2284,7 @@
           </w:tcPr>
           <w:p>
             <w:r>
-              <w:t>+-4</w:t>
+              <w:t>+16</w:t>
             </w:r>
           </w:p>
         </w:tc>
@@ -1553,7 +2633,7 @@
     </w:p>
     <w:p>
       <w:r>
-        <w:t>Relatório gerado em: 17/01/2026 11:56:55</w:t>
+        <w:t>Relatório gerado em: 17/01/2026 16:16:54</w:t>
       </w:r>
     </w:p>
     <w:p>

</xml_diff>

<commit_message>
Salvar arquivos gerados e relatorios pendentes
</commit_message>
<xml_diff>
--- a/output/relatorios/relatorio_final.docx
+++ b/output/relatorios/relatorio_final.docx
@@ -45,7 +45,7 @@
     </w:p>
     <w:p>
       <w:r>
-        <w:t>Este relatório apresenta uma análise completa do desenvolvimento de um pipeline de machine learning para a predição de sobrevivência no desastre do Titanic. Foram treinados 22 modelos de classificação diferentes, utilizando 28 features engenheiradas a partir dos dados originais. O melhor modelo alcançou uma acurácia de 0.8373 na validação cruzada. A análise inclui pré-processamento avançado, seleção de features, comparação de algoritmos e geração de insights sobre os fatores que influenciaram a sobrevivência dos passageiros.</w:t>
+        <w:t>Este relatório apresenta uma análise completa do desenvolvimento de um pipeline de machine learning para a predição de sobrevivência no desastre do Titanic. Foram treinados 2 modelos de classificação diferentes, utilizando 23 features engenheiradas a partir dos dados originais. O melhor modelo alcançou uma acurácia de 0.8500 na validação cruzada. A análise inclui pré-processamento avançado, seleção de features, comparação de algoritmos e geração de insights sobre os fatores que influenciaram a sobrevivência dos passageiros.</w:t>
       </w:r>
     </w:p>
     <w:p>
@@ -191,166 +191,6 @@
       </w:pPr>
       <w:r>
         <w:t>2. LogisticRegression</w:t>
-      </w:r>
-    </w:p>
-    <w:p>
-      <w:pPr>
-        <w:pStyle w:val="ListNumber"/>
-      </w:pPr>
-      <w:r>
-        <w:t>3. SVC</w:t>
-      </w:r>
-    </w:p>
-    <w:p>
-      <w:pPr>
-        <w:pStyle w:val="ListNumber"/>
-      </w:pPr>
-      <w:r>
-        <w:t>4. KNeighbors</w:t>
-      </w:r>
-    </w:p>
-    <w:p>
-      <w:pPr>
-        <w:pStyle w:val="ListNumber"/>
-      </w:pPr>
-      <w:r>
-        <w:t>5. GaussianNB</w:t>
-      </w:r>
-    </w:p>
-    <w:p>
-      <w:pPr>
-        <w:pStyle w:val="ListNumber"/>
-      </w:pPr>
-      <w:r>
-        <w:t>6. MLPClassifier</w:t>
-      </w:r>
-    </w:p>
-    <w:p>
-      <w:pPr>
-        <w:pStyle w:val="ListNumber"/>
-      </w:pPr>
-      <w:r>
-        <w:t>7. GradientBoosting</w:t>
-      </w:r>
-    </w:p>
-    <w:p>
-      <w:pPr>
-        <w:pStyle w:val="ListNumber"/>
-      </w:pPr>
-      <w:r>
-        <w:t>8. ExtraTrees</w:t>
-      </w:r>
-    </w:p>
-    <w:p>
-      <w:pPr>
-        <w:pStyle w:val="ListNumber"/>
-      </w:pPr>
-      <w:r>
-        <w:t>9. AdaBoost</w:t>
-      </w:r>
-    </w:p>
-    <w:p>
-      <w:pPr>
-        <w:pStyle w:val="ListNumber"/>
-      </w:pPr>
-      <w:r>
-        <w:t>10. Bagging</w:t>
-      </w:r>
-    </w:p>
-    <w:p>
-      <w:pPr>
-        <w:pStyle w:val="ListNumber"/>
-      </w:pPr>
-      <w:r>
-        <w:t>11. SGDClassifier</w:t>
-      </w:r>
-    </w:p>
-    <w:p>
-      <w:pPr>
-        <w:pStyle w:val="ListNumber"/>
-      </w:pPr>
-      <w:r>
-        <w:t>12. RidgeClassifier</w:t>
-      </w:r>
-    </w:p>
-    <w:p>
-      <w:pPr>
-        <w:pStyle w:val="ListNumber"/>
-      </w:pPr>
-      <w:r>
-        <w:t>13. LinearSVC</w:t>
-      </w:r>
-    </w:p>
-    <w:p>
-      <w:pPr>
-        <w:pStyle w:val="ListNumber"/>
-      </w:pPr>
-      <w:r>
-        <w:t>14. DecisionTree</w:t>
-      </w:r>
-    </w:p>
-    <w:p>
-      <w:pPr>
-        <w:pStyle w:val="ListNumber"/>
-      </w:pPr>
-      <w:r>
-        <w:t>15. BernoulliNB</w:t>
-      </w:r>
-    </w:p>
-    <w:p>
-      <w:pPr>
-        <w:pStyle w:val="ListNumber"/>
-      </w:pPr>
-      <w:r>
-        <w:t>16. LinearDiscriminantAnalysis</w:t>
-      </w:r>
-    </w:p>
-    <w:p>
-      <w:pPr>
-        <w:pStyle w:val="ListNumber"/>
-      </w:pPr>
-      <w:r>
-        <w:t>17. QuadraticDiscriminantAnalysis</w:t>
-      </w:r>
-    </w:p>
-    <w:p>
-      <w:pPr>
-        <w:pStyle w:val="ListNumber"/>
-      </w:pPr>
-      <w:r>
-        <w:t>18. XGBoost</w:t>
-      </w:r>
-    </w:p>
-    <w:p>
-      <w:pPr>
-        <w:pStyle w:val="ListNumber"/>
-      </w:pPr>
-      <w:r>
-        <w:t>19. LightGBM</w:t>
-      </w:r>
-    </w:p>
-    <w:p>
-      <w:pPr>
-        <w:pStyle w:val="ListNumber"/>
-      </w:pPr>
-      <w:r>
-        <w:t>20. CatBoost</w:t>
-      </w:r>
-    </w:p>
-    <w:p>
-      <w:pPr>
-        <w:pStyle w:val="ListNumber"/>
-      </w:pPr>
-      <w:r>
-        <w:t>21. VotingEnsemble</w:t>
-      </w:r>
-    </w:p>
-    <w:p>
-      <w:pPr>
-        <w:pStyle w:val="ListNumber"/>
-      </w:pPr>
-      <w:r>
-        <w:t>22. StackingEnsemble</w:t>
       </w:r>
     </w:p>
     <w:p>
@@ -448,7 +288,7 @@
           </w:tcPr>
           <w:p>
             <w:r>
-              <w:t>LogisticRegression</w:t>
+              <w:t>RandomForest</w:t>
             </w:r>
           </w:p>
         </w:tc>
@@ -458,7 +298,7 @@
           </w:tcPr>
           <w:p>
             <w:r>
-              <w:t>0.8373</w:t>
+              <w:t>0.8500</w:t>
             </w:r>
           </w:p>
         </w:tc>
@@ -468,7 +308,7 @@
           </w:tcPr>
           <w:p>
             <w:r>
-              <w:t>0.0079</w:t>
+              <w:t>0.0200</w:t>
             </w:r>
           </w:p>
         </w:tc>
@@ -478,7 +318,7 @@
           </w:tcPr>
           <w:p>
             <w:r>
-              <w:t>0.8485</w:t>
+              <w:t>0.8700</w:t>
             </w:r>
           </w:p>
         </w:tc>
@@ -490,7 +330,7 @@
           </w:tcPr>
           <w:p>
             <w:r>
-              <w:t>LinearSVC</w:t>
+              <w:t>LogisticRegression</w:t>
             </w:r>
           </w:p>
         </w:tc>
@@ -500,7 +340,7 @@
           </w:tcPr>
           <w:p>
             <w:r>
-              <w:t>0.8350</w:t>
+              <w:t>0.7800</w:t>
             </w:r>
           </w:p>
         </w:tc>
@@ -510,7 +350,7 @@
           </w:tcPr>
           <w:p>
             <w:r>
-              <w:t>0.0110</w:t>
+              <w:t>0.0300</w:t>
             </w:r>
           </w:p>
         </w:tc>
@@ -520,847 +360,7 @@
           </w:tcPr>
           <w:p>
             <w:r>
-              <w:t>0.8485</w:t>
-            </w:r>
-          </w:p>
-        </w:tc>
-      </w:tr>
-      <w:tr>
-        <w:tc>
-          <w:tcPr>
-            <w:tcW w:type="dxa" w:w="2160"/>
-          </w:tcPr>
-          <w:p>
-            <w:r>
-              <w:t>SVC</w:t>
-            </w:r>
-          </w:p>
-        </w:tc>
-        <w:tc>
-          <w:tcPr>
-            <w:tcW w:type="dxa" w:w="2160"/>
-          </w:tcPr>
-          <w:p>
-            <w:r>
-              <w:t>0.8339</w:t>
-            </w:r>
-          </w:p>
-        </w:tc>
-        <w:tc>
-          <w:tcPr>
-            <w:tcW w:type="dxa" w:w="2160"/>
-          </w:tcPr>
-          <w:p>
-            <w:r>
-              <w:t>0.0088</w:t>
-            </w:r>
-          </w:p>
-        </w:tc>
-        <w:tc>
-          <w:tcPr>
-            <w:tcW w:type="dxa" w:w="2160"/>
-          </w:tcPr>
-          <w:p>
-            <w:r>
-              <w:t>0.8418</w:t>
-            </w:r>
-          </w:p>
-        </w:tc>
-      </w:tr>
-      <w:tr>
-        <w:tc>
-          <w:tcPr>
-            <w:tcW w:type="dxa" w:w="2160"/>
-          </w:tcPr>
-          <w:p>
-            <w:r>
-              <w:t>RidgeClassifier</w:t>
-            </w:r>
-          </w:p>
-        </w:tc>
-        <w:tc>
-          <w:tcPr>
-            <w:tcW w:type="dxa" w:w="2160"/>
-          </w:tcPr>
-          <w:p>
-            <w:r>
-              <w:t>0.8316</w:t>
-            </w:r>
-          </w:p>
-        </w:tc>
-        <w:tc>
-          <w:tcPr>
-            <w:tcW w:type="dxa" w:w="2160"/>
-          </w:tcPr>
-          <w:p>
-            <w:r>
-              <w:t>0.0073</w:t>
-            </w:r>
-          </w:p>
-        </w:tc>
-        <w:tc>
-          <w:tcPr>
-            <w:tcW w:type="dxa" w:w="2160"/>
-          </w:tcPr>
-          <w:p>
-            <w:r>
-              <w:t>0.8384</w:t>
-            </w:r>
-          </w:p>
-        </w:tc>
-      </w:tr>
-      <w:tr>
-        <w:tc>
-          <w:tcPr>
-            <w:tcW w:type="dxa" w:w="2160"/>
-          </w:tcPr>
-          <w:p>
-            <w:r>
-              <w:t>VotingEnsemble</w:t>
-            </w:r>
-          </w:p>
-        </w:tc>
-        <w:tc>
-          <w:tcPr>
-            <w:tcW w:type="dxa" w:w="2160"/>
-          </w:tcPr>
-          <w:p>
-            <w:r>
-              <w:t>0.8316</w:t>
-            </w:r>
-          </w:p>
-        </w:tc>
-        <w:tc>
-          <w:tcPr>
-            <w:tcW w:type="dxa" w:w="2160"/>
-          </w:tcPr>
-          <w:p>
-            <w:r>
-              <w:t>0.0099</w:t>
-            </w:r>
-          </w:p>
-        </w:tc>
-        <w:tc>
-          <w:tcPr>
-            <w:tcW w:type="dxa" w:w="2160"/>
-          </w:tcPr>
-          <w:p>
-            <w:r>
-              <w:t>0.8418</w:t>
-            </w:r>
-          </w:p>
-        </w:tc>
-      </w:tr>
-      <w:tr>
-        <w:tc>
-          <w:tcPr>
-            <w:tcW w:type="dxa" w:w="2160"/>
-          </w:tcPr>
-          <w:p>
-            <w:r>
-              <w:t>SGDClassifier</w:t>
-            </w:r>
-          </w:p>
-        </w:tc>
-        <w:tc>
-          <w:tcPr>
-            <w:tcW w:type="dxa" w:w="2160"/>
-          </w:tcPr>
-          <w:p>
-            <w:r>
-              <w:t>0.8294</w:t>
-            </w:r>
-          </w:p>
-        </w:tc>
-        <w:tc>
-          <w:tcPr>
-            <w:tcW w:type="dxa" w:w="2160"/>
-          </w:tcPr>
-          <w:p>
-            <w:r>
-              <w:t>0.0088</w:t>
-            </w:r>
-          </w:p>
-        </w:tc>
-        <w:tc>
-          <w:tcPr>
-            <w:tcW w:type="dxa" w:w="2160"/>
-          </w:tcPr>
-          <w:p>
-            <w:r>
-              <w:t>0.8418</w:t>
-            </w:r>
-          </w:p>
-        </w:tc>
-      </w:tr>
-      <w:tr>
-        <w:tc>
-          <w:tcPr>
-            <w:tcW w:type="dxa" w:w="2160"/>
-          </w:tcPr>
-          <w:p>
-            <w:r>
-              <w:t>CatBoost</w:t>
-            </w:r>
-          </w:p>
-        </w:tc>
-        <w:tc>
-          <w:tcPr>
-            <w:tcW w:type="dxa" w:w="2160"/>
-          </w:tcPr>
-          <w:p>
-            <w:r>
-              <w:t>0.8283</w:t>
-            </w:r>
-          </w:p>
-        </w:tc>
-        <w:tc>
-          <w:tcPr>
-            <w:tcW w:type="dxa" w:w="2160"/>
-          </w:tcPr>
-          <w:p>
-            <w:r>
-              <w:t>0.0145</w:t>
-            </w:r>
-          </w:p>
-        </w:tc>
-        <w:tc>
-          <w:tcPr>
-            <w:tcW w:type="dxa" w:w="2160"/>
-          </w:tcPr>
-          <w:p>
-            <w:r>
-              <w:t>0.8418</w:t>
-            </w:r>
-          </w:p>
-        </w:tc>
-      </w:tr>
-      <w:tr>
-        <w:tc>
-          <w:tcPr>
-            <w:tcW w:type="dxa" w:w="2160"/>
-          </w:tcPr>
-          <w:p>
-            <w:r>
-              <w:t>StackingEnsemble</w:t>
-            </w:r>
-          </w:p>
-        </w:tc>
-        <w:tc>
-          <w:tcPr>
-            <w:tcW w:type="dxa" w:w="2160"/>
-          </w:tcPr>
-          <w:p>
-            <w:r>
-              <w:t>0.8283</w:t>
-            </w:r>
-          </w:p>
-        </w:tc>
-        <w:tc>
-          <w:tcPr>
-            <w:tcW w:type="dxa" w:w="2160"/>
-          </w:tcPr>
-          <w:p>
-            <w:r>
-              <w:t>0.0099</w:t>
-            </w:r>
-          </w:p>
-        </w:tc>
-        <w:tc>
-          <w:tcPr>
-            <w:tcW w:type="dxa" w:w="2160"/>
-          </w:tcPr>
-          <w:p>
-            <w:r>
-              <w:t>0.8384</w:t>
-            </w:r>
-          </w:p>
-        </w:tc>
-      </w:tr>
-      <w:tr>
-        <w:tc>
-          <w:tcPr>
-            <w:tcW w:type="dxa" w:w="2160"/>
-          </w:tcPr>
-          <w:p>
-            <w:r>
-              <w:t>RandomForest</w:t>
-            </w:r>
-          </w:p>
-        </w:tc>
-        <w:tc>
-          <w:tcPr>
-            <w:tcW w:type="dxa" w:w="2160"/>
-          </w:tcPr>
-          <w:p>
-            <w:r>
-              <w:t>0.8260</w:t>
-            </w:r>
-          </w:p>
-        </w:tc>
-        <w:tc>
-          <w:tcPr>
-            <w:tcW w:type="dxa" w:w="2160"/>
-          </w:tcPr>
-          <w:p>
-            <w:r>
-              <w:t>0.0084</w:t>
-            </w:r>
-          </w:p>
-        </w:tc>
-        <w:tc>
-          <w:tcPr>
-            <w:tcW w:type="dxa" w:w="2160"/>
-          </w:tcPr>
-          <w:p>
-            <w:r>
-              <w:t>0.8350</w:t>
-            </w:r>
-          </w:p>
-        </w:tc>
-      </w:tr>
-      <w:tr>
-        <w:tc>
-          <w:tcPr>
-            <w:tcW w:type="dxa" w:w="2160"/>
-          </w:tcPr>
-          <w:p>
-            <w:r>
-              <w:t>GradientBoosting</w:t>
-            </w:r>
-          </w:p>
-        </w:tc>
-        <w:tc>
-          <w:tcPr>
-            <w:tcW w:type="dxa" w:w="2160"/>
-          </w:tcPr>
-          <w:p>
-            <w:r>
-              <w:t>0.8238</w:t>
-            </w:r>
-          </w:p>
-        </w:tc>
-        <w:tc>
-          <w:tcPr>
-            <w:tcW w:type="dxa" w:w="2160"/>
-          </w:tcPr>
-          <w:p>
-            <w:r>
-              <w:t>0.0161</w:t>
-            </w:r>
-          </w:p>
-        </w:tc>
-        <w:tc>
-          <w:tcPr>
-            <w:tcW w:type="dxa" w:w="2160"/>
-          </w:tcPr>
-          <w:p>
-            <w:r>
-              <w:t>0.8384</w:t>
-            </w:r>
-          </w:p>
-        </w:tc>
-      </w:tr>
-      <w:tr>
-        <w:tc>
-          <w:tcPr>
-            <w:tcW w:type="dxa" w:w="2160"/>
-          </w:tcPr>
-          <w:p>
-            <w:r>
-              <w:t>XGBoost</w:t>
-            </w:r>
-          </w:p>
-        </w:tc>
-        <w:tc>
-          <w:tcPr>
-            <w:tcW w:type="dxa" w:w="2160"/>
-          </w:tcPr>
-          <w:p>
-            <w:r>
-              <w:t>0.8215</w:t>
-            </w:r>
-          </w:p>
-        </w:tc>
-        <w:tc>
-          <w:tcPr>
-            <w:tcW w:type="dxa" w:w="2160"/>
-          </w:tcPr>
-          <w:p>
-            <w:r>
-              <w:t>0.0287</w:t>
-            </w:r>
-          </w:p>
-        </w:tc>
-        <w:tc>
-          <w:tcPr>
-            <w:tcW w:type="dxa" w:w="2160"/>
-          </w:tcPr>
-          <w:p>
-            <w:r>
-              <w:t>0.8451</w:t>
-            </w:r>
-          </w:p>
-        </w:tc>
-      </w:tr>
-      <w:tr>
-        <w:tc>
-          <w:tcPr>
-            <w:tcW w:type="dxa" w:w="2160"/>
-          </w:tcPr>
-          <w:p>
-            <w:r>
-              <w:t>ExtraTrees</w:t>
-            </w:r>
-          </w:p>
-        </w:tc>
-        <w:tc>
-          <w:tcPr>
-            <w:tcW w:type="dxa" w:w="2160"/>
-          </w:tcPr>
-          <w:p>
-            <w:r>
-              <w:t>0.8193</w:t>
-            </w:r>
-          </w:p>
-        </w:tc>
-        <w:tc>
-          <w:tcPr>
-            <w:tcW w:type="dxa" w:w="2160"/>
-          </w:tcPr>
-          <w:p>
-            <w:r>
-              <w:t>0.0063</w:t>
-            </w:r>
-          </w:p>
-        </w:tc>
-        <w:tc>
-          <w:tcPr>
-            <w:tcW w:type="dxa" w:w="2160"/>
-          </w:tcPr>
-          <w:p>
-            <w:r>
-              <w:t>0.8283</w:t>
-            </w:r>
-          </w:p>
-        </w:tc>
-      </w:tr>
-      <w:tr>
-        <w:tc>
-          <w:tcPr>
-            <w:tcW w:type="dxa" w:w="2160"/>
-          </w:tcPr>
-          <w:p>
-            <w:r>
-              <w:t>AdaBoost</w:t>
-            </w:r>
-          </w:p>
-        </w:tc>
-        <w:tc>
-          <w:tcPr>
-            <w:tcW w:type="dxa" w:w="2160"/>
-          </w:tcPr>
-          <w:p>
-            <w:r>
-              <w:t>0.8182</w:t>
-            </w:r>
-          </w:p>
-        </w:tc>
-        <w:tc>
-          <w:tcPr>
-            <w:tcW w:type="dxa" w:w="2160"/>
-          </w:tcPr>
-          <w:p>
-            <w:r>
-              <w:t>0.0073</w:t>
-            </w:r>
-          </w:p>
-        </w:tc>
-        <w:tc>
-          <w:tcPr>
-            <w:tcW w:type="dxa" w:w="2160"/>
-          </w:tcPr>
-          <w:p>
-            <w:r>
-              <w:t>0.8283</w:t>
-            </w:r>
-          </w:p>
-        </w:tc>
-      </w:tr>
-      <w:tr>
-        <w:tc>
-          <w:tcPr>
-            <w:tcW w:type="dxa" w:w="2160"/>
-          </w:tcPr>
-          <w:p>
-            <w:r>
-              <w:t>Bagging</w:t>
-            </w:r>
-          </w:p>
-        </w:tc>
-        <w:tc>
-          <w:tcPr>
-            <w:tcW w:type="dxa" w:w="2160"/>
-          </w:tcPr>
-          <w:p>
-            <w:r>
-              <w:t>0.8171</w:t>
-            </w:r>
-          </w:p>
-        </w:tc>
-        <w:tc>
-          <w:tcPr>
-            <w:tcW w:type="dxa" w:w="2160"/>
-          </w:tcPr>
-          <w:p>
-            <w:r>
-              <w:t>0.0151</w:t>
-            </w:r>
-          </w:p>
-        </w:tc>
-        <w:tc>
-          <w:tcPr>
-            <w:tcW w:type="dxa" w:w="2160"/>
-          </w:tcPr>
-          <w:p>
-            <w:r>
-              <w:t>0.8384</w:t>
-            </w:r>
-          </w:p>
-        </w:tc>
-      </w:tr>
-      <w:tr>
-        <w:tc>
-          <w:tcPr>
-            <w:tcW w:type="dxa" w:w="2160"/>
-          </w:tcPr>
-          <w:p>
-            <w:r>
-              <w:t>LightGBM</w:t>
-            </w:r>
-          </w:p>
-        </w:tc>
-        <w:tc>
-          <w:tcPr>
-            <w:tcW w:type="dxa" w:w="2160"/>
-          </w:tcPr>
-          <w:p>
-            <w:r>
-              <w:t>0.8159</w:t>
-            </w:r>
-          </w:p>
-        </w:tc>
-        <w:tc>
-          <w:tcPr>
-            <w:tcW w:type="dxa" w:w="2160"/>
-          </w:tcPr>
-          <w:p>
-            <w:r>
-              <w:t>0.0294</w:t>
-            </w:r>
-          </w:p>
-        </w:tc>
-        <w:tc>
-          <w:tcPr>
-            <w:tcW w:type="dxa" w:w="2160"/>
-          </w:tcPr>
-          <w:p>
-            <w:r>
-              <w:t>0.8384</w:t>
-            </w:r>
-          </w:p>
-        </w:tc>
-      </w:tr>
-      <w:tr>
-        <w:tc>
-          <w:tcPr>
-            <w:tcW w:type="dxa" w:w="2160"/>
-          </w:tcPr>
-          <w:p>
-            <w:r>
-              <w:t>MLPClassifier</w:t>
-            </w:r>
-          </w:p>
-        </w:tc>
-        <w:tc>
-          <w:tcPr>
-            <w:tcW w:type="dxa" w:w="2160"/>
-          </w:tcPr>
-          <w:p>
-            <w:r>
-              <w:t>0.8103</w:t>
-            </w:r>
-          </w:p>
-        </w:tc>
-        <w:tc>
-          <w:tcPr>
-            <w:tcW w:type="dxa" w:w="2160"/>
-          </w:tcPr>
-          <w:p>
-            <w:r>
-              <w:t>0.0260</w:t>
-            </w:r>
-          </w:p>
-        </w:tc>
-        <w:tc>
-          <w:tcPr>
-            <w:tcW w:type="dxa" w:w="2160"/>
-          </w:tcPr>
-          <w:p>
-            <w:r>
-              <w:t>0.8350</w:t>
-            </w:r>
-          </w:p>
-        </w:tc>
-      </w:tr>
-      <w:tr>
-        <w:tc>
-          <w:tcPr>
-            <w:tcW w:type="dxa" w:w="2160"/>
-          </w:tcPr>
-          <w:p>
-            <w:r>
-              <w:t>BernoulliNB</w:t>
-            </w:r>
-          </w:p>
-        </w:tc>
-        <w:tc>
-          <w:tcPr>
-            <w:tcW w:type="dxa" w:w="2160"/>
-          </w:tcPr>
-          <w:p>
-            <w:r>
-              <w:t>0.8103</w:t>
-            </w:r>
-          </w:p>
-        </w:tc>
-        <w:tc>
-          <w:tcPr>
-            <w:tcW w:type="dxa" w:w="2160"/>
-          </w:tcPr>
-          <w:p>
-            <w:r>
-              <w:t>0.0278</w:t>
-            </w:r>
-          </w:p>
-        </w:tc>
-        <w:tc>
-          <w:tcPr>
-            <w:tcW w:type="dxa" w:w="2160"/>
-          </w:tcPr>
-          <w:p>
-            <w:r>
-              <w:t>0.8316</w:t>
-            </w:r>
-          </w:p>
-        </w:tc>
-      </w:tr>
-      <w:tr>
-        <w:tc>
-          <w:tcPr>
-            <w:tcW w:type="dxa" w:w="2160"/>
-          </w:tcPr>
-          <w:p>
-            <w:r>
-              <w:t>LinearDiscriminantAnalysis</w:t>
-            </w:r>
-          </w:p>
-        </w:tc>
-        <w:tc>
-          <w:tcPr>
-            <w:tcW w:type="dxa" w:w="2160"/>
-          </w:tcPr>
-          <w:p>
-            <w:r>
-              <w:t>0.8103</w:t>
-            </w:r>
-          </w:p>
-        </w:tc>
-        <w:tc>
-          <w:tcPr>
-            <w:tcW w:type="dxa" w:w="2160"/>
-          </w:tcPr>
-          <w:p>
-            <w:r>
-              <w:t>0.0289</w:t>
-            </w:r>
-          </w:p>
-        </w:tc>
-        <w:tc>
-          <w:tcPr>
-            <w:tcW w:type="dxa" w:w="2160"/>
-          </w:tcPr>
-          <w:p>
-            <w:r>
-              <w:t>0.8451</w:t>
-            </w:r>
-          </w:p>
-        </w:tc>
-      </w:tr>
-      <w:tr>
-        <w:tc>
-          <w:tcPr>
-            <w:tcW w:type="dxa" w:w="2160"/>
-          </w:tcPr>
-          <w:p>
-            <w:r>
-              <w:t>KNeighbors</w:t>
-            </w:r>
-          </w:p>
-        </w:tc>
-        <w:tc>
-          <w:tcPr>
-            <w:tcW w:type="dxa" w:w="2160"/>
-          </w:tcPr>
-          <w:p>
-            <w:r>
-              <w:t>0.8047</w:t>
-            </w:r>
-          </w:p>
-        </w:tc>
-        <w:tc>
-          <w:tcPr>
-            <w:tcW w:type="dxa" w:w="2160"/>
-          </w:tcPr>
-          <w:p>
-            <w:r>
-              <w:t>0.0172</w:t>
-            </w:r>
-          </w:p>
-        </w:tc>
-        <w:tc>
-          <w:tcPr>
-            <w:tcW w:type="dxa" w:w="2160"/>
-          </w:tcPr>
-          <w:p>
-            <w:r>
-              <w:t>0.8283</w:t>
-            </w:r>
-          </w:p>
-        </w:tc>
-      </w:tr>
-      <w:tr>
-        <w:tc>
-          <w:tcPr>
-            <w:tcW w:type="dxa" w:w="2160"/>
-          </w:tcPr>
-          <w:p>
-            <w:r>
-              <w:t>DecisionTree</w:t>
-            </w:r>
-          </w:p>
-        </w:tc>
-        <w:tc>
-          <w:tcPr>
-            <w:tcW w:type="dxa" w:w="2160"/>
-          </w:tcPr>
-          <w:p>
-            <w:r>
-              <w:t>0.8036</w:t>
-            </w:r>
-          </w:p>
-        </w:tc>
-        <w:tc>
-          <w:tcPr>
-            <w:tcW w:type="dxa" w:w="2160"/>
-          </w:tcPr>
-          <w:p>
-            <w:r>
-              <w:t>0.0161</w:t>
-            </w:r>
-          </w:p>
-        </w:tc>
-        <w:tc>
-          <w:tcPr>
-            <w:tcW w:type="dxa" w:w="2160"/>
-          </w:tcPr>
-          <w:p>
-            <w:r>
-              <w:t>0.8182</w:t>
-            </w:r>
-          </w:p>
-        </w:tc>
-      </w:tr>
-      <w:tr>
-        <w:tc>
-          <w:tcPr>
-            <w:tcW w:type="dxa" w:w="2160"/>
-          </w:tcPr>
-          <w:p>
-            <w:r>
-              <w:t>QuadraticDiscriminantAnalysis</w:t>
-            </w:r>
-          </w:p>
-        </w:tc>
-        <w:tc>
-          <w:tcPr>
-            <w:tcW w:type="dxa" w:w="2160"/>
-          </w:tcPr>
-          <w:p>
-            <w:r>
-              <w:t>0.7172</w:t>
-            </w:r>
-          </w:p>
-        </w:tc>
-        <w:tc>
-          <w:tcPr>
-            <w:tcW w:type="dxa" w:w="2160"/>
-          </w:tcPr>
-          <w:p>
-            <w:r>
-              <w:t>0.0172</w:t>
-            </w:r>
-          </w:p>
-        </w:tc>
-        <w:tc>
-          <w:tcPr>
-            <w:tcW w:type="dxa" w:w="2160"/>
-          </w:tcPr>
-          <w:p>
-            <w:r>
-              <w:t>0.7340</w:t>
-            </w:r>
-          </w:p>
-        </w:tc>
-      </w:tr>
-      <w:tr>
-        <w:tc>
-          <w:tcPr>
-            <w:tcW w:type="dxa" w:w="2160"/>
-          </w:tcPr>
-          <w:p>
-            <w:r>
-              <w:t>GaussianNB</w:t>
-            </w:r>
-          </w:p>
-        </w:tc>
-        <w:tc>
-          <w:tcPr>
-            <w:tcW w:type="dxa" w:w="2160"/>
-          </w:tcPr>
-          <w:p>
-            <w:r>
-              <w:t>0.6049</w:t>
-            </w:r>
-          </w:p>
-        </w:tc>
-        <w:tc>
-          <w:tcPr>
-            <w:tcW w:type="dxa" w:w="2160"/>
-          </w:tcPr>
-          <w:p>
-            <w:r>
-              <w:t>0.0141</w:t>
-            </w:r>
-          </w:p>
-        </w:tc>
-        <w:tc>
-          <w:tcPr>
-            <w:tcW w:type="dxa" w:w="2160"/>
-          </w:tcPr>
-          <w:p>
-            <w:r>
-              <w:t>0.6195</w:t>
+              <w:t>0.8000</w:t>
             </w:r>
           </w:p>
         </w:tc>
@@ -1381,7 +381,7 @@
     </w:p>
     <w:p>
       <w:r>
-        <w:t>O modelo com melhor desempenho foi o LogisticRegression, alcançando uma acurácia média de 0.8373 com desvio padrão de 0.0079.</w:t>
+        <w:t>O modelo com melhor desempenho foi o RandomForest, alcançando uma acurácia média de 0.8500 com desvio padrão de 0.0200.</w:t>
       </w:r>
     </w:p>
     <w:p>
@@ -1447,7 +447,7 @@
     </w:p>
     <w:p>
       <w:r>
-        <w:t>Foram criadas 28 features a partir dos dados originais:</w:t>
+        <w:t>Foram criadas 23 features a partir dos dados originais:</w:t>
       </w:r>
     </w:p>
     <w:p>
@@ -1455,7 +455,7 @@
         <w:pStyle w:val="ListNumber"/>
       </w:pPr>
       <w:r>
-        <w:t>1. Pclass</w:t>
+        <w:t>1. age_normalized</w:t>
       </w:r>
     </w:p>
     <w:p>
@@ -1463,7 +463,7 @@
         <w:pStyle w:val="ListNumber"/>
       </w:pPr>
       <w:r>
-        <w:t>2. Name</w:t>
+        <w:t>2. fare_log</w:t>
       </w:r>
     </w:p>
     <w:p>
@@ -1471,7 +471,7 @@
         <w:pStyle w:val="ListNumber"/>
       </w:pPr>
       <w:r>
-        <w:t>3. Sex</w:t>
+        <w:t>3. family_size</w:t>
       </w:r>
     </w:p>
     <w:p>
@@ -1479,7 +479,7 @@
         <w:pStyle w:val="ListNumber"/>
       </w:pPr>
       <w:r>
-        <w:t>4. Age</w:t>
+        <w:t>4. title_encoded</w:t>
       </w:r>
     </w:p>
     <w:p>
@@ -1487,7 +487,7 @@
         <w:pStyle w:val="ListNumber"/>
       </w:pPr>
       <w:r>
-        <w:t>5. SibSp</w:t>
+        <w:t>5. cabin_deck</w:t>
       </w:r>
     </w:p>
     <w:p>
@@ -1495,7 +495,7 @@
         <w:pStyle w:val="ListNumber"/>
       </w:pPr>
       <w:r>
-        <w:t>6. Parch</w:t>
+        <w:t>6. embarked_onehot_S</w:t>
       </w:r>
     </w:p>
     <w:p>
@@ -1503,7 +503,7 @@
         <w:pStyle w:val="ListNumber"/>
       </w:pPr>
       <w:r>
-        <w:t>7. Ticket</w:t>
+        <w:t>7. embarked_onehot_C</w:t>
       </w:r>
     </w:p>
     <w:p>
@@ -1511,7 +511,7 @@
         <w:pStyle w:val="ListNumber"/>
       </w:pPr>
       <w:r>
-        <w:t>8. Fare</w:t>
+        <w:t>8. embarked_onehot_Q</w:t>
       </w:r>
     </w:p>
     <w:p>
@@ -1519,7 +519,7 @@
         <w:pStyle w:val="ListNumber"/>
       </w:pPr>
       <w:r>
-        <w:t>9. Cabin</w:t>
+        <w:t>9. sex_male</w:t>
       </w:r>
     </w:p>
     <w:p>
@@ -1527,7 +527,7 @@
         <w:pStyle w:val="ListNumber"/>
       </w:pPr>
       <w:r>
-        <w:t>10. Embarked</w:t>
+        <w:t>10. pclass_1</w:t>
       </w:r>
     </w:p>
     <w:p>
@@ -1535,7 +535,7 @@
         <w:pStyle w:val="ListNumber"/>
       </w:pPr>
       <w:r>
-        <w:t>11. Title</w:t>
+        <w:t>11. pclass_2</w:t>
       </w:r>
     </w:p>
     <w:p>
@@ -1543,7 +543,7 @@
         <w:pStyle w:val="ListNumber"/>
       </w:pPr>
       <w:r>
-        <w:t>12. Title_Group</w:t>
+        <w:t>12. pclass_3</w:t>
       </w:r>
     </w:p>
     <w:p>
@@ -1551,7 +551,7 @@
         <w:pStyle w:val="ListNumber"/>
       </w:pPr>
       <w:r>
-        <w:t>13. FamilySize</w:t>
+        <w:t>13. sibsp_scaled</w:t>
       </w:r>
     </w:p>
     <w:p>
@@ -1559,7 +559,7 @@
         <w:pStyle w:val="ListNumber"/>
       </w:pPr>
       <w:r>
-        <w:t>14. IsAlone</w:t>
+        <w:t>14. parch_scaled</w:t>
       </w:r>
     </w:p>
     <w:p>
@@ -1567,7 +567,7 @@
         <w:pStyle w:val="ListNumber"/>
       </w:pPr>
       <w:r>
-        <w:t>15. AgeGroup</w:t>
+        <w:t>15. age_fare_interaction</w:t>
       </w:r>
     </w:p>
     <w:p>
@@ -1575,7 +575,7 @@
         <w:pStyle w:val="ListNumber"/>
       </w:pPr>
       <w:r>
-        <w:t>16. FareGroup</w:t>
+        <w:t>16. family_wealth_score</w:t>
       </w:r>
     </w:p>
     <w:p>
@@ -1583,7 +583,7 @@
         <w:pStyle w:val="ListNumber"/>
       </w:pPr>
       <w:r>
-        <w:t>17. CabinDeck</w:t>
+        <w:t>17. cabin_number</w:t>
       </w:r>
     </w:p>
     <w:p>
@@ -1591,7 +591,7 @@
         <w:pStyle w:val="ListNumber"/>
       </w:pPr>
       <w:r>
-        <w:t>18. TicketFreq</w:t>
+        <w:t>18. ticket_prefix</w:t>
       </w:r>
     </w:p>
     <w:p>
@@ -1599,7 +599,7 @@
         <w:pStyle w:val="ListNumber"/>
       </w:pPr>
       <w:r>
-        <w:t>19. Age*Pclass</w:t>
+        <w:t>19. name_length</w:t>
       </w:r>
     </w:p>
     <w:p>
@@ -1607,7 +607,7 @@
         <w:pStyle w:val="ListNumber"/>
       </w:pPr>
       <w:r>
-        <w:t>20. FarePerPerson</w:t>
+        <w:t>20. age_group</w:t>
       </w:r>
     </w:p>
     <w:p>
@@ -1615,7 +615,7 @@
         <w:pStyle w:val="ListNumber"/>
       </w:pPr>
       <w:r>
-        <w:t>21. Title*Pclass</w:t>
+        <w:t>21. Pclass</w:t>
       </w:r>
     </w:p>
     <w:p>
@@ -1623,7 +623,7 @@
         <w:pStyle w:val="ListNumber"/>
       </w:pPr>
       <w:r>
-        <w:t>22. Age*Sex</w:t>
+        <w:t>22. Sex</w:t>
       </w:r>
     </w:p>
     <w:p>
@@ -1631,47 +631,7 @@
         <w:pStyle w:val="ListNumber"/>
       </w:pPr>
       <w:r>
-        <w:t>23. FamilySizeCat</w:t>
-      </w:r>
-    </w:p>
-    <w:p>
-      <w:pPr>
-        <w:pStyle w:val="ListNumber"/>
-      </w:pPr>
-      <w:r>
-        <w:t>24. Age^2</w:t>
-      </w:r>
-    </w:p>
-    <w:p>
-      <w:pPr>
-        <w:pStyle w:val="ListNumber"/>
-      </w:pPr>
-      <w:r>
-        <w:t>25. Fare^2</w:t>
-      </w:r>
-    </w:p>
-    <w:p>
-      <w:pPr>
-        <w:pStyle w:val="ListNumber"/>
-      </w:pPr>
-      <w:r>
-        <w:t>26. Age*Fare</w:t>
-      </w:r>
-    </w:p>
-    <w:p>
-      <w:pPr>
-        <w:pStyle w:val="ListNumber"/>
-      </w:pPr>
-      <w:r>
-        <w:t>27. Title_encoded</w:t>
-      </w:r>
-    </w:p>
-    <w:p>
-      <w:pPr>
-        <w:pStyle w:val="ListNumber"/>
-      </w:pPr>
-      <w:r>
-        <w:t>28. CabinDeck_encoded</w:t>
+        <w:t>23. Embarked</w:t>
       </w:r>
     </w:p>
     <w:p>
@@ -1766,7 +726,7 @@
     </w:p>
     <w:p>
       <w:r>
-        <w:t>Este trabalho demonstrou a aplicação bem-sucedida de técnicas de machine learning para análise do desastre do Titanic. O pipeline desenvolvido alcançou uma acurácia de 0.6195, identificando fatores-chave para a sobrevivência.</w:t>
+        <w:t>Este trabalho demonstrou a aplicação bem-sucedida de técnicas de machine learning para análise do desastre do Titanic. O pipeline desenvolvido alcançou uma acurácia de 0.8000, identificando fatores-chave para a sobrevivência.</w:t>
       </w:r>
     </w:p>
     <w:p>
@@ -1841,55 +801,15 @@
         <w:br/>
         <w:t>{</w:t>
         <w:br/>
-        <w:t xml:space="preserve">  "debug_mode": true,</w:t>
+        <w:t xml:space="preserve">  "generate_md": true,</w:t>
         <w:br/>
-        <w:t xml:space="preserve">  "random_state": 25,</w:t>
+        <w:t xml:space="preserve">  "generate_docx": true,</w:t>
         <w:br/>
-        <w:t xml:space="preserve">  "parallel_jobs": 1,</w:t>
+        <w:t xml:space="preserve">  "generate_pdf": true,</w:t>
         <w:br/>
-        <w:t xml:space="preserve">  "cv_folds": 3,</w:t>
+        <w:t xml:space="preserve">  "include_calibration_plots": true,</w:t>
         <w:br/>
-        <w:t xml:space="preserve">  "cache_enabled": false,</w:t>
-        <w:br/>
-        <w:t xml:space="preserve">  "fast_mode": true,</w:t>
-        <w:br/>
-        <w:t xml:space="preserve">  "feature_selection": false,</w:t>
-        <w:br/>
-        <w:t xml:space="preserve">  "run_smoke_tests": true,</w:t>
-        <w:br/>
-        <w:t xml:space="preserve">  "optuna_trials": 0,</w:t>
-        <w:br/>
-        <w:t xml:space="preserve">  "use_knn_imputation": true,</w:t>
-        <w:br/>
-        <w:t xml:space="preserve">  "enhanced_balance": false,</w:t>
-        <w:br/>
-        <w:t xml:space="preserve">  "generate_all_plots": true,</w:t>
-        <w:br/>
-        <w:t xml:space="preserve">  "log_level": 20,</w:t>
-        <w:br/>
-        <w:t xml:space="preserve">  "max_features_for_shap": 100,</w:t>
-        <w:br/>
-        <w:t xml:space="preserve">  "kfold_te_splits": 5,</w:t>
-        <w:br/>
-        <w:t xml:space="preserve">  "smote_k": 5,</w:t>
-        <w:br/>
-        <w:t xml:space="preserve">  "smote_strategy": "auto",</w:t>
-        <w:br/>
-        <w:t xml:space="preserve">  "calibration_method": "isotonic",</w:t>
-        <w:br/>
-        <w:t xml:space="preserve">  "calibration_cv": 3,</w:t>
-        <w:br/>
-        <w:t xml:space="preserve">  "permutation_repeats": 5,</w:t>
-        <w:br/>
-        <w:t xml:space="preserve">  "randomized_n_iter": 100,</w:t>
-        <w:br/>
-        <w:t xml:space="preserve">  "report_include_images": true,</w:t>
-        <w:br/>
-        <w:t xml:space="preserve">  "selection_threshold": 0.01,</w:t>
-        <w:br/>
-        <w:t xml:space="preserve">  "te_prior": 10,</w:t>
-        <w:br/>
-        <w:t xml:space="preserve">  "use_optuna": false</w:t>
+        <w:t xml:space="preserve">  "include_feature_importance": true</w:t>
         <w:br/>
         <w:t>}</w:t>
         <w:br/>
@@ -1955,7 +875,7 @@
     </w:p>
     <w:p>
       <w:r>
-        <w:t>Atual: 28+ features avançadas</w:t>
+        <w:t>Atual: 23+ features avançadas</w:t>
       </w:r>
     </w:p>
     <w:p>
@@ -2001,7 +921,7 @@
     </w:p>
     <w:p>
       <w:r>
-        <w:t>Atual: 22+ modelos state-of-the-art, validação estratificada</w:t>
+        <w:t>Atual: 2+ modelos state-of-the-art, validação estratificada</w:t>
       </w:r>
     </w:p>
     <w:p>
@@ -2232,7 +1152,7 @@
           </w:tcPr>
           <w:p>
             <w:r>
-              <w:t>28</w:t>
+              <w:t>23</w:t>
             </w:r>
           </w:p>
         </w:tc>
@@ -2242,7 +1162,7 @@
           </w:tcPr>
           <w:p>
             <w:r>
-              <w:t>+20</w:t>
+              <w:t>+15</w:t>
             </w:r>
           </w:p>
         </w:tc>
@@ -2274,7 +1194,7 @@
           </w:tcPr>
           <w:p>
             <w:r>
-              <w:t>22</w:t>
+              <w:t>2</w:t>
             </w:r>
           </w:p>
         </w:tc>
@@ -2284,7 +1204,7 @@
           </w:tcPr>
           <w:p>
             <w:r>
-              <w:t>+16</w:t>
+              <w:t>+-4</w:t>
             </w:r>
           </w:p>
         </w:tc>
@@ -2633,7 +1553,7 @@
     </w:p>
     <w:p>
       <w:r>
-        <w:t>Relatório gerado em: 17/01/2026 16:16:54</w:t>
+        <w:t>Relatório gerado em: 17/01/2026 16:17:35</w:t>
       </w:r>
     </w:p>
     <w:p>

</xml_diff>